<commit_message>
Telas de recebidas, locais, prompts e classificacoes; ajuda embutida
</commit_message>
<xml_diff>
--- a/docs/TCC-Classificador-Violencia-Armada.docx
+++ b/docs/TCC-Classificador-Violencia-Armada.docx
@@ -214,7 +214,7 @@
           <w:b w:val="0"/>
           <w:i w:val="0"/>
         </w:rPr>
-        <w:t>Este documento descreve o método, a implementação e o protocolo de avaliação de um sistema que classifica notícias de violência armada em indicadores, substituindo a triagem manual que hoje limita o volume de notícias analisadas e a velocidade de atualização dos indicadores. A classificação é organizada em duas etapas encadeadas. A primeira é binária e tem premissa única: determinar se a notícia relata disparo de arma de fogo. A segunda, aplicada somente ao que passa pela primeira, atribui a motivação principal entre 15 categorias e os indicadores de contexto. Para cada etapa são comparados 6 modelos pré-treinados — monolíngues de português e multilíngues — sob uma grade de 4 configurações de hiperparâmetros, com relato de acurácia, precisão, recall e medida F1, em versões macro, ponderada e por classe, acompanhadas da matriz de confusão. Uma camada de modelo de linguagem de grande porte opera após os classificadores, encarregada da confirmação contextual e da consolidação de vítimas. O documento detalha a construção do corpus anotado manualmente, o protocolo de divisão amostral, os critérios de seleção de hiperparâmetros e as ameaças à validade dos resultados.</w:t>
+        <w:t>Este documento descreve o método, a implementação e o protocolo de avaliação de um sistema que classifica notícias de violência armada em indicadores, substituindo a triagem manual que hoje limita o volume de notícias analisadas e a velocidade de atualização dos indicadores. A classificação é uma tarefa única e multirrótulo: dado o texto, quais dos 7 indicadores a notícia sustenta — podem ser vários ao mesmo tempo, ou nenhum. Não há etapa binária de triagem antes dela: a notícia fora do escopo é justamente a que não recebe indicador algum, e esses exemplos negativos são parte do corpus, não descarte. São comparados 3 modelos pré-treinados monolíngues de português sob uma grade de 4 configurações de hiperparâmetros, em 3 estratégias de ajuste, com relato de acurácia, precisão, recall e medida F1, em versões macro, ponderada e por classe, acompanhadas da matriz de confusão. Um modelo de linguagem de grande porte opera APÓS a marcação e condicionado a ela: ele recebe somente as instruções das classes marcadas, e a sua tarefa é aprofundá-las — montar a lista de vítimas, preencher a ficha de cada uma e as tabelas complementares. O documento detalha a construção do corpus anotado manualmente, o protocolo de divisão amostral, os critérios de seleção de hiperparâmetros e as ameaças à validade dos resultados.</w:t>
       </w:r>
     </w:p>
     <w:p>
@@ -320,7 +320,7 @@
           <w:b w:val="0"/>
           <w:i w:val="0"/>
         </w:rPr>
-        <w:t>O problema tratado é o da triagem e classificação automáticas de notícias para alimentar indicadores de violência armada, preservando a qualidade da classificação manual. A dificuldade está em três pontos. Primeiro, a decisão de escopo é sutil: muitas notícias mencionam armas de fogo sem relatar disparo. Segundo, as categorias de motivação não são mutuamente evidentes a partir de palavras isoladas, pois dependem da relação entre quem atirou, contra quem e por quê. Terceiro, a contagem de vítimas exige consolidar fontes diferentes sobre o mesmo fato sem somá-las indevidamente.</w:t>
+        <w:t>O problema tratado é o da triagem e classificação automáticas de notícias para alimentar indicadores de violência armada, preservando a qualidade da classificação manual. A dificuldade está em três pontos. Primeiro, a decisão de escopo é sutil: muitas notícias mencionam armas de fogo sem relatar disparo, e o recorte do banco é estrito — registra-se disparo de arma de fogo, e vítima é apenas quem foi atingido por disparo, não quem se feriu em queda, correria, estilhaço ou mal-estar durante o fato. Segundo, os indicadores não são mutuamente evidentes a partir de palavras isoladas, pois dependem da relação entre quem atirou, contra quem e em que circunstância: a mesma expressão aparece em notícias que recebem indicadores diferentes. Terceiro, a contagem de vítimas exige consolidar fontes diferentes sobre o mesmo fato sem somá-las indevidamente.</w:t>
       </w:r>
     </w:p>
     <w:p>
@@ -341,7 +341,7 @@
           <w:b w:val="0"/>
           <w:i w:val="0"/>
         </w:rPr>
-        <w:t>O objetivo geral é projetar, implementar e avaliar um sistema de classificação automática de notícias de violência armada em dois estágios, com camada posterior de validação por modelo de linguagem.</w:t>
+        <w:t>O objetivo geral é projetar, implementar e avaliar um sistema de classificação automática de notícias de violência armada em indicadores, no qual um classificador ajustado decide QUAIS indicadores a notícia sustenta e um modelo de linguagem de grande porte aprofunda apenas os indicadores marcados, extraindo deles a lista de vítimas e os campos estruturados.</w:t>
       </w:r>
     </w:p>
     <w:p>
@@ -373,7 +373,7 @@
         <w:ind w:left="709"/>
       </w:pPr>
       <w:r>
-        <w:t>comparar modelos pré-treinados de português e multilíngues na tarefa binária de identificação de disparo de arma de fogo;</w:t>
+        <w:t>comparar modelos pré-treinados monolíngues de português na atribuição multirrótulo dos 7 indicadores;</w:t>
       </w:r>
     </w:p>
     <w:p>
@@ -383,7 +383,7 @@
         <w:ind w:left="709"/>
       </w:pPr>
       <w:r>
-        <w:t>comparar os mesmos modelos na tarefa de atribuição de motivação e na atribuição multirrótulo de indicadores de contexto;</w:t>
+        <w:t>comparar as 3 estratégias de ajuste — uma rede com uma saída por indicador, uma rede binária por indicador, e um comitê de três modelos por indicador com decisão por votação — na mesma partição de teste;</w:t>
       </w:r>
     </w:p>
     <w:p>
@@ -434,7 +434,33 @@
           <w:b w:val="0"/>
           <w:i w:val="0"/>
         </w:rPr>
-        <w:t>A arquitetura em dois estágios com validação posterior não é um detalhe de implementação, e sim a resposta a uma restrição de custo. Submeter toda notícia coletada a um modelo de linguagem de grande porte é caro e lento. Um classificador pequeno, treinado especificamente para a decisão de escopo, descarta antecipadamente o que está fora dele, e a chamada custosa é reservada ao que sobrou. O desenho também torna o sistema auditável: separando a decisão de escopo da decisão de categoria, é possível medir cada uma isoladamente e identificar em qual estágio um erro se originou.</w:t>
+        <w:t>A divisão de trabalho entre o classificador e o modelo de linguagem não é um detalhe de implementação, e sim a resposta a uma restrição de custo medida em produção. Submeter toda notícia coletada a um modelo de linguagem de grande porte é caro e lento, e o limite não é teórico: o plano contratado concede 8.000 tokens por minuto, enquanto uma chamada que carrega as instruções de todos os indicadores consome cerca de 6.800 — uma classificação por minuto. Com a marcação prévia, apenas as instruções das classes marcadas viajam, e a mesma chamada cai para cerca de 4.200 tokens.</w:t>
+      </w:r>
+    </w:p>
+    <w:p>
+      <w:pPr>
+        <w:spacing w:after="120"/>
+        <w:ind w:firstLine="709"/>
+      </w:pPr>
+      <w:r>
+        <w:rPr>
+          <w:b w:val="0"/>
+          <w:i w:val="0"/>
+        </w:rPr>
+        <w:t>A folga assim obtida não é só economia. Ela é o que permite elevar o esforço de raciocínio do modelo de linguagem, e esse parâmetro mostrou-se decisivo para a estabilidade da extração: com esforço baixo, a mesma notícia submetida oito vezes produziu contagens de vítimas divergentes em quatro delas, inclusive uma lista vazia para um texto que descreve duas pessoas atingidas; com esforço médio, as cinco execuções foram concordantes. O classificador, portanto, não apenas reduz o custo: ele compra a margem de que a etapa seguinte precisa para ser confiável.</w:t>
+      </w:r>
+    </w:p>
+    <w:p>
+      <w:pPr>
+        <w:spacing w:after="120"/>
+        <w:ind w:firstLine="709"/>
+      </w:pPr>
+      <w:r>
+        <w:rPr>
+          <w:b w:val="0"/>
+          <w:i w:val="0"/>
+        </w:rPr>
+        <w:t>O desenho também torna o sistema auditável. A marcação é registrada com a confiança de cada classe antes de o modelo de linguagem ver o texto, de modo que um erro do classificador corrigido adiante não desaparece do registro. É esse registro que permite dizer se um erro veio da marcação ou da extração, e é dele que sai o exemplo para o treino seguinte.</w:t>
       </w:r>
     </w:p>
     <w:p>
@@ -510,7 +536,20 @@
           <w:b w:val="0"/>
           <w:i w:val="0"/>
         </w:rPr>
-        <w:t>Modelos multilíngues cobrem dezenas de idiomas com um único vocabulário de subpalavras, o que reduz a capacidade dedicada a cada língua. Modelos monolíngues de português, treinados sobre corpora da língua, tendem a segmentar melhor o vocabulário e a capturar construções próprias do português brasileiro, incluindo o registro jornalístico e os termos do campo da segurança pública. A comparação entre as duas famílias é um dos eixos deste trabalho, e não uma premissa adotada de antemão.</w:t>
+        <w:t>Modelos multilíngues cobrem dezenas de idiomas com um único vocabulário de subpalavras, o que reduz a capacidade dedicada a cada língua. Modelos monolíngues de português, treinados sobre corpora da língua, tendem a segmentar melhor o vocabulário e a capturar construções próprias do português brasileiro, incluindo o registro jornalístico e os termos do campo da segurança pública.</w:t>
+      </w:r>
+    </w:p>
+    <w:p>
+      <w:pPr>
+        <w:spacing w:after="120"/>
+        <w:ind w:firstLine="709"/>
+      </w:pPr>
+      <w:r>
+        <w:rPr>
+          <w:b w:val="0"/>
+          <w:i w:val="0"/>
+        </w:rPr>
+        <w:t>Este trabalho adota o pré-treinamento monolíngue como PREMISSA, e não como hipótese a testar: a comparação restringe-se a modelos de português, e nenhum modelo multilíngue é submetido. A decisão é de recorte, e tem consequência sobre o que se pode afirmar ao final — os resultados permitem dizer qual modelo de português se comporta melhor nesta tarefa, e não se o pré-treinamento em português é superior ao multilíngue. Verificar essa superioridade exigiria incluir ao menos um modelo multilíngue, e fica registrada entre os trabalhos futuros.</w:t>
       </w:r>
     </w:p>
     <w:p>
@@ -920,7 +959,7 @@
           <w:b w:val="0"/>
           <w:i w:val="0"/>
         </w:rPr>
-        <w:t>A matriz de confusão dispõe os rótulos verdadeiros nas linhas e as predições nas colunas. A diagonal principal contém os acertos; cada célula fora dela indica com qual classe o modelo confundiu a classe da linha. Seu valor diagnóstico está justamente fora da diagonal: ela mostra se os erros se concentram em pares de categorias semanticamente próximas, o que sugere revisão dos critérios de anotação, ou se estão dispersos, o que sugere insuficiência de exemplos.</w:t>
+        <w:t>A matriz de confusão dispõe os rótulos verdadeiros nas linhas e as predições nas colunas. A diagonal principal contém os acertos; cada célula fora dela indica com qual classe o modelo confundiu a classe da linha. Seu valor diagnóstico está justamente fora da diagonal: ela mostra se os erros se concentram em pares de classes semanticamente próximas, o que sugere revisão dos critérios de anotação, ou se estão dispersos, o que sugere insuficiência de exemplos.</w:t>
       </w:r>
     </w:p>
     <w:p>
@@ -967,7 +1006,7 @@
           <w:b w:val="0"/>
           <w:i w:val="0"/>
         </w:rPr>
-        <w:t>O sistema recebe a notícia, reduz o texto, aplica o classificador de escopo e, se a notícia estiver no escopo, aplica os classificadores de categoria. A saída dos classificadores é então submetida ao modelo de linguagem, responsável pela confirmação contextual e pela consolidação da lista de vítimas. O resultado é gravado com situação “não aprovado” e segue para revisão humana.</w:t>
+        <w:t>A notícia entra por uma fila de recebidas, com o endereço eletrônico, a data informada e o texto integral. O classificador a lê e atribui, a cada indicador, uma decisão que não é binária: na estratégia de comitê, conta-se quantos dos três modelos marcaram aquele indicador, e a notícia é encaminhada conforme a concordância — nenhum voto exige revisão humana, voto isolado gera alerta a ser verificado, e dois ou três seguem adiante. Somente o que segue chega ao modelo de linguagem, e ele recebe apenas as instruções dos indicadores marcados. Sua tarefa é aprofundá-los: montar a lista de pessoas atingidas, preencher a ficha de cada uma e as tabelas complementares. O resultado é gravado com situação “não aprovado” e segue para revisão humana; ao ser aprovado, cada notícia da ocorrência retorna ao corpus como exemplo rotulado, fechando o ciclo de treino.</w:t>
       </w:r>
     </w:p>
     <w:p>
@@ -1070,7 +1109,243 @@
                 <w:b w:val="0"/>
                 <w:sz w:val="20"/>
               </w:rPr>
-              <w:t>1. Abertura</w:t>
+              <w:t>1. Recebimento</w:t>
+            </w:r>
+          </w:p>
+        </w:tc>
+        <w:tc>
+          <w:tcPr>
+            <w:tcW w:type="dxa" w:w="1361"/>
+          </w:tcPr>
+          <w:p>
+            <w:pPr>
+              <w:spacing w:line="240" w:lineRule="auto" w:after="40" w:before="40"/>
+              <w:jc w:val="left"/>
+            </w:pPr>
+            <w:r/>
+            <w:r>
+              <w:rPr>
+                <w:b w:val="0"/>
+                <w:sz w:val="20"/>
+              </w:rPr>
+              <w:t>humana</w:t>
+            </w:r>
+          </w:p>
+        </w:tc>
+        <w:tc>
+          <w:tcPr>
+            <w:tcW w:type="dxa" w:w="5783"/>
+          </w:tcPr>
+          <w:p>
+            <w:pPr>
+              <w:spacing w:line="240" w:lineRule="auto" w:after="40" w:before="40"/>
+              <w:jc w:val="left"/>
+            </w:pPr>
+            <w:r/>
+            <w:r>
+              <w:rPr>
+                <w:b w:val="0"/>
+                <w:sz w:val="20"/>
+              </w:rPr>
+              <w:t>Analista informa endereço eletrônico, data e texto.</w:t>
+            </w:r>
+          </w:p>
+        </w:tc>
+      </w:tr>
+      <w:tr>
+        <w:tc>
+          <w:tcPr>
+            <w:tcW w:type="dxa" w:w="1928"/>
+          </w:tcPr>
+          <w:p>
+            <w:pPr>
+              <w:spacing w:line="240" w:lineRule="auto" w:after="40" w:before="40"/>
+              <w:jc w:val="left"/>
+            </w:pPr>
+            <w:r/>
+            <w:r>
+              <w:rPr>
+                <w:b w:val="0"/>
+                <w:sz w:val="20"/>
+              </w:rPr>
+              <w:t>2. Marcação</w:t>
+            </w:r>
+          </w:p>
+        </w:tc>
+        <w:tc>
+          <w:tcPr>
+            <w:tcW w:type="dxa" w:w="1361"/>
+          </w:tcPr>
+          <w:p>
+            <w:pPr>
+              <w:spacing w:line="240" w:lineRule="auto" w:after="40" w:before="40"/>
+              <w:jc w:val="left"/>
+            </w:pPr>
+            <w:r/>
+            <w:r>
+              <w:rPr>
+                <w:b w:val="0"/>
+                <w:sz w:val="20"/>
+              </w:rPr>
+              <w:t>automática</w:t>
+            </w:r>
+          </w:p>
+        </w:tc>
+        <w:tc>
+          <w:tcPr>
+            <w:tcW w:type="dxa" w:w="5783"/>
+          </w:tcPr>
+          <w:p>
+            <w:pPr>
+              <w:spacing w:line="240" w:lineRule="auto" w:after="40" w:before="40"/>
+              <w:jc w:val="left"/>
+            </w:pPr>
+            <w:r/>
+            <w:r>
+              <w:rPr>
+                <w:b w:val="0"/>
+                <w:sz w:val="20"/>
+              </w:rPr>
+              <w:t>Classificador multirrótulo atribui indicadores.</w:t>
+            </w:r>
+          </w:p>
+        </w:tc>
+      </w:tr>
+      <w:tr>
+        <w:tc>
+          <w:tcPr>
+            <w:tcW w:type="dxa" w:w="1928"/>
+          </w:tcPr>
+          <w:p>
+            <w:pPr>
+              <w:spacing w:line="240" w:lineRule="auto" w:after="40" w:before="40"/>
+              <w:jc w:val="left"/>
+            </w:pPr>
+            <w:r/>
+            <w:r>
+              <w:rPr>
+                <w:b w:val="0"/>
+                <w:sz w:val="20"/>
+              </w:rPr>
+              <w:t>3. Triagem</w:t>
+            </w:r>
+          </w:p>
+        </w:tc>
+        <w:tc>
+          <w:tcPr>
+            <w:tcW w:type="dxa" w:w="1361"/>
+          </w:tcPr>
+          <w:p>
+            <w:pPr>
+              <w:spacing w:line="240" w:lineRule="auto" w:after="40" w:before="40"/>
+              <w:jc w:val="left"/>
+            </w:pPr>
+            <w:r/>
+            <w:r>
+              <w:rPr>
+                <w:b w:val="0"/>
+                <w:sz w:val="20"/>
+              </w:rPr>
+              <w:t>automática</w:t>
+            </w:r>
+          </w:p>
+        </w:tc>
+        <w:tc>
+          <w:tcPr>
+            <w:tcW w:type="dxa" w:w="5783"/>
+          </w:tcPr>
+          <w:p>
+            <w:pPr>
+              <w:spacing w:line="240" w:lineRule="auto" w:after="40" w:before="40"/>
+              <w:jc w:val="left"/>
+            </w:pPr>
+            <w:r/>
+            <w:r>
+              <w:rPr>
+                <w:b w:val="0"/>
+                <w:sz w:val="20"/>
+              </w:rPr>
+              <w:t>Encaminhamento por faixa de concordância.</w:t>
+            </w:r>
+          </w:p>
+        </w:tc>
+      </w:tr>
+      <w:tr>
+        <w:tc>
+          <w:tcPr>
+            <w:tcW w:type="dxa" w:w="1928"/>
+          </w:tcPr>
+          <w:p>
+            <w:pPr>
+              <w:spacing w:line="240" w:lineRule="auto" w:after="40" w:before="40"/>
+              <w:jc w:val="left"/>
+            </w:pPr>
+            <w:r/>
+            <w:r>
+              <w:rPr>
+                <w:b w:val="0"/>
+                <w:sz w:val="20"/>
+              </w:rPr>
+              <w:t>4. Revisão da faixa</w:t>
+            </w:r>
+          </w:p>
+        </w:tc>
+        <w:tc>
+          <w:tcPr>
+            <w:tcW w:type="dxa" w:w="1361"/>
+          </w:tcPr>
+          <w:p>
+            <w:pPr>
+              <w:spacing w:line="240" w:lineRule="auto" w:after="40" w:before="40"/>
+              <w:jc w:val="left"/>
+            </w:pPr>
+            <w:r/>
+            <w:r>
+              <w:rPr>
+                <w:b w:val="0"/>
+                <w:sz w:val="20"/>
+              </w:rPr>
+              <w:t>humana</w:t>
+            </w:r>
+          </w:p>
+        </w:tc>
+        <w:tc>
+          <w:tcPr>
+            <w:tcW w:type="dxa" w:w="5783"/>
+          </w:tcPr>
+          <w:p>
+            <w:pPr>
+              <w:spacing w:line="240" w:lineRule="auto" w:after="40" w:before="40"/>
+              <w:jc w:val="left"/>
+            </w:pPr>
+            <w:r/>
+            <w:r>
+              <w:rPr>
+                <w:b w:val="0"/>
+                <w:sz w:val="20"/>
+              </w:rPr>
+              <w:t>Confirmação do que ficou sem voto ou com voto isolado.</w:t>
+            </w:r>
+          </w:p>
+        </w:tc>
+      </w:tr>
+      <w:tr>
+        <w:tc>
+          <w:tcPr>
+            <w:tcW w:type="dxa" w:w="1928"/>
+          </w:tcPr>
+          <w:p>
+            <w:pPr>
+              <w:spacing w:line="240" w:lineRule="auto" w:after="40" w:before="40"/>
+              <w:jc w:val="left"/>
+            </w:pPr>
+            <w:r/>
+            <w:r>
+              <w:rPr>
+                <w:b w:val="0"/>
+                <w:sz w:val="20"/>
+              </w:rPr>
+              <w:t>5. Abertura</w:t>
             </w:r>
           </w:p>
         </w:tc>
@@ -1129,66 +1404,7 @@
                 <w:b w:val="0"/>
                 <w:sz w:val="20"/>
               </w:rPr>
-              <w:t>2. Inclusão</w:t>
-            </w:r>
-          </w:p>
-        </w:tc>
-        <w:tc>
-          <w:tcPr>
-            <w:tcW w:type="dxa" w:w="1361"/>
-          </w:tcPr>
-          <w:p>
-            <w:pPr>
-              <w:spacing w:line="240" w:lineRule="auto" w:after="40" w:before="40"/>
-              <w:jc w:val="left"/>
-            </w:pPr>
-            <w:r/>
-            <w:r>
-              <w:rPr>
-                <w:b w:val="0"/>
-                <w:sz w:val="20"/>
-              </w:rPr>
-              <w:t>humana</w:t>
-            </w:r>
-          </w:p>
-        </w:tc>
-        <w:tc>
-          <w:tcPr>
-            <w:tcW w:type="dxa" w:w="5783"/>
-          </w:tcPr>
-          <w:p>
-            <w:pPr>
-              <w:spacing w:line="240" w:lineRule="auto" w:after="40" w:before="40"/>
-              <w:jc w:val="left"/>
-            </w:pPr>
-            <w:r/>
-            <w:r>
-              <w:rPr>
-                <w:b w:val="0"/>
-                <w:sz w:val="20"/>
-              </w:rPr>
-              <w:t>Analista cola link e texto de uma ou mais notícias.</w:t>
-            </w:r>
-          </w:p>
-        </w:tc>
-      </w:tr>
-      <w:tr>
-        <w:tc>
-          <w:tcPr>
-            <w:tcW w:type="dxa" w:w="1928"/>
-          </w:tcPr>
-          <w:p>
-            <w:pPr>
-              <w:spacing w:line="240" w:lineRule="auto" w:after="40" w:before="40"/>
-              <w:jc w:val="left"/>
-            </w:pPr>
-            <w:r/>
-            <w:r>
-              <w:rPr>
-                <w:b w:val="0"/>
-                <w:sz w:val="20"/>
-              </w:rPr>
-              <w:t>3. Pré-processamento</w:t>
+              <w:t>6. Aprofundamento</w:t>
             </w:r>
           </w:p>
         </w:tc>
@@ -1226,184 +1442,7 @@
                 <w:b w:val="0"/>
                 <w:sz w:val="20"/>
               </w:rPr>
-              <w:t>Descarte de trechos sem relação com a ocorrência.</w:t>
-            </w:r>
-          </w:p>
-        </w:tc>
-      </w:tr>
-      <w:tr>
-        <w:tc>
-          <w:tcPr>
-            <w:tcW w:type="dxa" w:w="1928"/>
-          </w:tcPr>
-          <w:p>
-            <w:pPr>
-              <w:spacing w:line="240" w:lineRule="auto" w:after="40" w:before="40"/>
-              <w:jc w:val="left"/>
-            </w:pPr>
-            <w:r/>
-            <w:r>
-              <w:rPr>
-                <w:b w:val="0"/>
-                <w:sz w:val="20"/>
-              </w:rPr>
-              <w:t>4. Escopo</w:t>
-            </w:r>
-          </w:p>
-        </w:tc>
-        <w:tc>
-          <w:tcPr>
-            <w:tcW w:type="dxa" w:w="1361"/>
-          </w:tcPr>
-          <w:p>
-            <w:pPr>
-              <w:spacing w:line="240" w:lineRule="auto" w:after="40" w:before="40"/>
-              <w:jc w:val="left"/>
-            </w:pPr>
-            <w:r/>
-            <w:r>
-              <w:rPr>
-                <w:b w:val="0"/>
-                <w:sz w:val="20"/>
-              </w:rPr>
-              <w:t>automática</w:t>
-            </w:r>
-          </w:p>
-        </w:tc>
-        <w:tc>
-          <w:tcPr>
-            <w:tcW w:type="dxa" w:w="5783"/>
-          </w:tcPr>
-          <w:p>
-            <w:pPr>
-              <w:spacing w:line="240" w:lineRule="auto" w:after="40" w:before="40"/>
-              <w:jc w:val="left"/>
-            </w:pPr>
-            <w:r/>
-            <w:r>
-              <w:rPr>
-                <w:b w:val="0"/>
-                <w:sz w:val="20"/>
-              </w:rPr>
-              <w:t>Classificador binário: há disparo de arma de fogo?</w:t>
-            </w:r>
-          </w:p>
-        </w:tc>
-      </w:tr>
-      <w:tr>
-        <w:tc>
-          <w:tcPr>
-            <w:tcW w:type="dxa" w:w="1928"/>
-          </w:tcPr>
-          <w:p>
-            <w:pPr>
-              <w:spacing w:line="240" w:lineRule="auto" w:after="40" w:before="40"/>
-              <w:jc w:val="left"/>
-            </w:pPr>
-            <w:r/>
-            <w:r>
-              <w:rPr>
-                <w:b w:val="0"/>
-                <w:sz w:val="20"/>
-              </w:rPr>
-              <w:t>5. Categoria</w:t>
-            </w:r>
-          </w:p>
-        </w:tc>
-        <w:tc>
-          <w:tcPr>
-            <w:tcW w:type="dxa" w:w="1361"/>
-          </w:tcPr>
-          <w:p>
-            <w:pPr>
-              <w:spacing w:line="240" w:lineRule="auto" w:after="40" w:before="40"/>
-              <w:jc w:val="left"/>
-            </w:pPr>
-            <w:r/>
-            <w:r>
-              <w:rPr>
-                <w:b w:val="0"/>
-                <w:sz w:val="20"/>
-              </w:rPr>
-              <w:t>automática</w:t>
-            </w:r>
-          </w:p>
-        </w:tc>
-        <w:tc>
-          <w:tcPr>
-            <w:tcW w:type="dxa" w:w="5783"/>
-          </w:tcPr>
-          <w:p>
-            <w:pPr>
-              <w:spacing w:line="240" w:lineRule="auto" w:after="40" w:before="40"/>
-              <w:jc w:val="left"/>
-            </w:pPr>
-            <w:r/>
-            <w:r>
-              <w:rPr>
-                <w:b w:val="0"/>
-                <w:sz w:val="20"/>
-              </w:rPr>
-              <w:t>Motivação principal e indicadores de contexto.</w:t>
-            </w:r>
-          </w:p>
-        </w:tc>
-      </w:tr>
-      <w:tr>
-        <w:tc>
-          <w:tcPr>
-            <w:tcW w:type="dxa" w:w="1928"/>
-          </w:tcPr>
-          <w:p>
-            <w:pPr>
-              <w:spacing w:line="240" w:lineRule="auto" w:after="40" w:before="40"/>
-              <w:jc w:val="left"/>
-            </w:pPr>
-            <w:r/>
-            <w:r>
-              <w:rPr>
-                <w:b w:val="0"/>
-                <w:sz w:val="20"/>
-              </w:rPr>
-              <w:t>6. Validação</w:t>
-            </w:r>
-          </w:p>
-        </w:tc>
-        <w:tc>
-          <w:tcPr>
-            <w:tcW w:type="dxa" w:w="1361"/>
-          </w:tcPr>
-          <w:p>
-            <w:pPr>
-              <w:spacing w:line="240" w:lineRule="auto" w:after="40" w:before="40"/>
-              <w:jc w:val="left"/>
-            </w:pPr>
-            <w:r/>
-            <w:r>
-              <w:rPr>
-                <w:b w:val="0"/>
-                <w:sz w:val="20"/>
-              </w:rPr>
-              <w:t>automática</w:t>
-            </w:r>
-          </w:p>
-        </w:tc>
-        <w:tc>
-          <w:tcPr>
-            <w:tcW w:type="dxa" w:w="5783"/>
-          </w:tcPr>
-          <w:p>
-            <w:pPr>
-              <w:spacing w:line="240" w:lineRule="auto" w:after="40" w:before="40"/>
-              <w:jc w:val="left"/>
-            </w:pPr>
-            <w:r/>
-            <w:r>
-              <w:rPr>
-                <w:b w:val="0"/>
-                <w:sz w:val="20"/>
-              </w:rPr>
-              <w:t>Modelo de linguagem confirma e consolida vítimas.</w:t>
+              <w:t>Modelo de linguagem extrai vítimas e campos estruturados.</w:t>
             </w:r>
           </w:p>
         </w:tc>
@@ -1639,7 +1678,7 @@
                 <w:b w:val="0"/>
                 <w:sz w:val="20"/>
               </w:rPr>
-              <w:t>Responsável libera ou devolve o registro.</w:t>
+              <w:t>Responsável libera o registro; as notícias vão ao corpus.</w:t>
             </w:r>
           </w:p>
         </w:tc>
@@ -1663,7 +1702,7 @@
         <w:pStyle w:val="Heading2"/>
       </w:pPr>
       <w:r>
-        <w:t>3.2 Por que duas etapas de classificação</w:t>
+        <w:t>3.2 Por que o classificador decide e o modelo de linguagem aprofunda</w:t>
       </w:r>
     </w:p>
     <w:p>
@@ -1676,7 +1715,33 @@
           <w:b w:val="0"/>
           <w:i w:val="0"/>
         </w:rPr>
-        <w:t>A separação entre escopo e categoria tem três justificativas. A primeira é de custo: a etapa de escopo é a que recebe o maior volume e, por ser binária, pode ser resolvida por um modelo pequeno com alta confiança. A segunda é de interpretabilidade: uma matriz de confusão binária distingue claramente os dois tipos de erro — admitir notícia fora do escopo e rejeitar notícia dentro dele — que têm consequências diferentes para o indicador final. A terceira é de qualidade do treino da segunda etapa: ao restringir a classificação de motivação às notícias que efetivamente relatam disparo, evita-se ensinar o modelo a atribuir motivação a textos para os quais a pergunta não se aplica.</w:t>
+        <w:t>A divisão de papéis obedece a uma regra única: o classificador decide QUAIS indicadores existem na notícia; o modelo de linguagem só aprofunda dentro dos indicadores já marcados, e não pode acrescentar nenhum. O que ele devolver fora da marcação é descartado pelo sistema — não apenas desencorajado no texto da instrução, mas filtrado em código, porque instrução de prompt não é garantia.</w:t>
+      </w:r>
+    </w:p>
+    <w:p>
+      <w:pPr>
+        <w:spacing w:after="120"/>
+        <w:ind w:firstLine="709"/>
+      </w:pPr>
+      <w:r>
+        <w:rPr>
+          <w:b w:val="0"/>
+          <w:i w:val="0"/>
+        </w:rPr>
+        <w:t>A regra tem três justificativas. A primeira é de custo, e está quantificada na seção 1.4. A segunda é de consistência: dois classificadores gerais sobre o mesmo texto produzem duas respostas que podem divergir, e não haveria critério para decidir qual delas prevalece. A terceira é de mensurabilidade: a marcação é reprodutível e pode ser avaliada contra um conjunto de teste fixo, enquanto a extração do modelo de linguagem não é determinística — a mesma entrada produz saídas diferentes entre execuções. Concentrar a decisão de classe no componente mensurável é o que permite afirmar algo sobre o desempenho do sistema.</w:t>
+      </w:r>
+    </w:p>
+    <w:p>
+      <w:pPr>
+        <w:spacing w:after="120"/>
+        <w:ind w:firstLine="709"/>
+      </w:pPr>
+      <w:r>
+        <w:rPr>
+          <w:b w:val="0"/>
+          <w:i w:val="0"/>
+        </w:rPr>
+        <w:t>A marcação também AUTORIZA. Determinadas circunstâncias da vítima só são avaliadas quando a classe que as destrava foi marcada: feminicídio só é avaliado quando o indicador de mulheres baleadas está presente, e a circunstância de pessoa LGBTQIAPN+ apenas quando o indicador correspondente está. A instrução de cada uma só viaja no prompt quando pode ser usada, e a resposta é filtrada pela mesma condição, de modo que a autorização vale ainda que a instrução seja ignorada.</w:t>
       </w:r>
     </w:p>
     <w:p>
@@ -1731,7 +1796,7 @@
         <w:pStyle w:val="Heading2"/>
       </w:pPr>
       <w:r>
-        <w:t>4.1 A premissa da primeira tarefa</w:t>
+        <w:t>4.1 A premissa da anotação</w:t>
       </w:r>
     </w:p>
     <w:p>
@@ -1838,7 +1903,7 @@
         <w:pStyle w:val="Heading2"/>
       </w:pPr>
       <w:r>
-        <w:t>4.3 Anotação da segunda etapa</w:t>
+        <w:t>4.3 Princípios da anotação</w:t>
       </w:r>
     </w:p>
     <w:p>
@@ -1851,7 +1916,7 @@
           <w:b w:val="0"/>
           <w:i w:val="0"/>
         </w:rPr>
-        <w:t>A motivação principal é atribuída somente a notícias positivas na primeira etapa, entre as 15 categorias do Apêndice A. A anotação segue dois princípios herdados do manual de curadoria: classifica-se o fato que originou os tiros, não o seu desfecho, e consideram-se apenas as circunstâncias diretamente ligadas ao momento do disparo, desprezando antecedentes e consequências que não constituam novo disparo.</w:t>
+        <w:t>A anotação segue dois princípios herdados do manual de curadoria: consideram-se apenas as circunstâncias diretamente ligadas ao MOMENTO do disparo, desprezando antecedentes do envolvido e consequências posteriores que não constituam novo disparo; e o recorte é estrito quanto à natureza do ferimento, pois registra-se disparo de arma de fogo, não ferimento por queda, estilhaço, arma branca ou mal-estar ocorridos durante o mesmo fato.</w:t>
       </w:r>
     </w:p>
     <w:p>
@@ -1864,7 +1929,7 @@
           <w:b w:val="0"/>
           <w:i w:val="0"/>
         </w:rPr>
-        <w:t>Os indicadores de contexto formam tarefa multirrótulo independente: uma mesma notícia pode receber mais de um, ou nenhum.</w:t>
+        <w:t>A tarefa é multirrótulo: uma mesma notícia pode receber mais de um indicador, ou nenhum. O rótulo vazio é um rótulo válido e necessário, e a sua ausência no corpus é o que faz um classificador marcar algo em todo texto.</w:t>
       </w:r>
     </w:p>
     <w:p>
@@ -1906,7 +1971,20 @@
           <w:b w:val="0"/>
           <w:i w:val="0"/>
         </w:rPr>
-        <w:t>A anotação é feita em interface própria, integrada à aplicação, que cumpre o papel de ambientes especializados do gênero. A notícia é inserida com link, título e texto; a primeira decisão é binária e apresentada de forma destacada, com a premissa do disparo reafirmada na própria tela; as definições das categorias de motivação ficam disponíveis durante a anotação, o que reduz a dependência de memória do anotador. Notícias inseridas sem rótulo entram em uma fila, e há navegação direta para o próximo item pendente.</w:t>
+        <w:t>A anotação é feita em interface própria, integrada à aplicação, que cumpre o papel de ambientes especializados do gênero. A notícia é inserida com endereço eletrônico, data e texto, e o anotador marca os indicadores que o texto sustenta — nenhum, um ou vários. A definição de cada indicador fica visível ao lado da respectiva caixa durante a anotação, o que reduz a dependência de memória, e a tela afirma explicitamente que não marcar nada é uma decisão válida, não uma pendência.</w:t>
+      </w:r>
+    </w:p>
+    <w:p>
+      <w:pPr>
+        <w:spacing w:after="120"/>
+        <w:ind w:firstLine="709"/>
+      </w:pPr>
+      <w:r>
+        <w:rPr>
+          <w:b w:val="0"/>
+          <w:i w:val="0"/>
+        </w:rPr>
+        <w:t>A fila é ordenada por gravidade, não por data. Quando há modelo treinado, a notícia em que o classificador não marcou indicador algum aparece primeiro, sinalizada em vermelho: é o falso negativo, o erro mais custoso de não examinar, porque o indicador que o classificador não marca não chega a ser avaliado pela etapa seguinte. Em seguida vem o que recebeu voto isolado no comitê, sinalizado em laranja. A rotulagem feita nessa fila alimenta diretamente o corpus, de modo que o trabalho de conferência e o de construção do conjunto de treino são o mesmo trabalho.</w:t>
       </w:r>
     </w:p>
     <w:p>
@@ -1940,7 +2018,20 @@
           <w:b w:val="0"/>
           <w:i w:val="0"/>
         </w:rPr>
-        <w:t>Para a tarefa binária, um corpus equilibrado com algumas centenas de exemplos em cada classe é suficiente para estimativas estáveis. Para a tarefa de motivação, com 15 categorias, o requisito é substancialmente maior: mantendo a ordem de grandeza de algumas dezenas de exemplos por categoria no conjunto de treino, chega-se à casa do milhar de notícias anotadas. Categorias raras na realidade — e portanto raras no corpus — devem ser reportadas com o seu suporte explícito, e a discussão dos resultados precisa distinguir limitação do modelo de insuficiência amostral.</w:t>
+        <w:t>São 7 indicadores, e a exigência amostral se conta por indicador, não por notícia: mantendo a ordem de grandeza de algumas dezenas de exemplos positivos de cada um no conjunto de treino, e somando os exemplos sem indicador algum, chega-se à casa das centenas de notícias anotadas. Como a tarefa é multirrótulo, uma mesma notícia contribui para mais de um indicador, o que atenua o total, porém não socorre o indicador raro — que continua dependendo de encontrar notícias em que ele apareça.</w:t>
+      </w:r>
+    </w:p>
+    <w:p>
+      <w:pPr>
+        <w:spacing w:after="120"/>
+        <w:ind w:firstLine="709"/>
+      </w:pPr>
+      <w:r>
+        <w:rPr>
+          <w:b w:val="0"/>
+          <w:i w:val="0"/>
+        </w:rPr>
+        <w:t>Indicadores raros na realidade — e portanto raros no corpus — devem ser reportados com o seu suporte explícito, e a discussão dos resultados precisa distinguir limitação do modelo de insuficiência amostral. O sistema não permite treinar com menos de três exemplos da classe mais rara, por não haver como representá-la nas três partições, e sinaliza como instável toda classe com menos de 30 exemplos.</w:t>
       </w:r>
     </w:p>
     <w:p>
@@ -1979,7 +2070,7 @@
           <w:b w:val="0"/>
           <w:i w:val="0"/>
         </w:rPr>
-        <w:t>O pré-processamento adotado opera no nível da sentença. Um modelo de processamento de linguagem natural segmenta o texto e preserva as sentenças que contenham pelo menos um termo do vocabulário relevante — extraído automaticamente das próprias definições das categorias — ou uma entidade nomeada de pessoa, local ou organização. Se o filtro for agressivo demais e restar menos de um mínimo de sentenças, o texto original é mantido, de modo que o procedimento nunca piore a entrada.</w:t>
+        <w:t>O pré-processamento implementado opera no nível da sentença. Um modelo de processamento de linguagem natural segmenta o texto e preserva as sentenças que contenham pelo menos um termo do vocabulário relevante — extraído das definições dos indicadores e das listas fechadas do dicionário de dados — ou uma entidade nomeada de pessoa, local ou organização. Se o filtro for agressivo demais e restar menos de um mínimo de sentenças, o texto original é mantido, de modo que o procedimento nunca piore a entrada.</w:t>
       </w:r>
     </w:p>
     <w:p>
@@ -1992,7 +2083,20 @@
           <w:b w:val="0"/>
           <w:i w:val="0"/>
         </w:rPr>
-        <w:t>Uma segunda forma de compressão, no nível da palavra, com remoção de palavras funcionais e lematização, foi implementada e deliberadamente deixada fora do fluxo padrão. Ela remove preposições como “por” e “contra”, que são exatamente os elementos que marcam quem atirou contra quem. A supressão dessas marcas inverteu a direção atribuída ao disparo em testes conduzidos durante o desenvolvimento, produzindo classificação incorreta. O caso é registrado aqui porque ilustra um risco geral: técnicas de normalização avaliadas apenas pela economia de tokens podem destruir a informação que sustenta a tarefa.</w:t>
+        <w:t>ESSE FILTRO ESTÁ DESLIGADO POR PADRÃO, e a decisão é resultado de medição. Aplicado às notícias já coletadas, ele descartou cerca de um décimo do texto, e entre o descartado havia fato material: de uma reportagem sobre tiroteio saíram a sentença que posicionava a vítima em relação à viatura policial e a que informava o estado de saúde das pessoas atingidas. Nenhuma das duas continha termo do vocabulário nem entidade nomeada, e esse é todo o critério do filtro. A economia obtida, da ordem de algumas dezenas de tokens por notícia, não compensa o risco de suprimir a informação que sustenta a classificação; o recurso permanece disponível para o caso de o orçamento de tokens se tornar restritivo.</w:t>
+      </w:r>
+    </w:p>
+    <w:p>
+      <w:pPr>
+        <w:spacing w:after="120"/>
+        <w:ind w:firstLine="709"/>
+      </w:pPr>
+      <w:r>
+        <w:rPr>
+          <w:b w:val="0"/>
+          <w:i w:val="0"/>
+        </w:rPr>
+        <w:t>Uma segunda forma de compressão, no nível da palavra, com remoção de palavras funcionais e lematização, foi implementada, testada e posteriormente removida do código. Ela remove preposições como “por” e “contra”, que são exatamente os elementos que marcam quem atirou contra quem. A supressão dessas marcas inverteu a direção atribuída ao disparo em testes conduzidos durante o desenvolvimento, produzindo classificação incorreta. O caso é registrado aqui porque ilustra um risco geral: técnicas de normalização avaliadas apenas pela economia de tokens podem destruir a informação que sustenta a tarefa.</w:t>
       </w:r>
     </w:p>
     <w:p>
@@ -2047,7 +2151,7 @@
           <w:b w:val="0"/>
           <w:i w:val="0"/>
         </w:rPr>
-        <w:t>A divisão é estratificada para que a proporção entre classes se mantenha nas três partições. A implementação adotada estratifica de forma exata pelo rótulo binário e distribui as motivações dentro de cada grupo por intercalação: as listas de cada motivação são embaralhadas e percorridas em paralelo, formando uma sequência em que o primeiro exemplo de cada categoria aparece antes do segundo de qualquer outra.</w:t>
+        <w:t>A divisão é estratificada para que a proporção de cada indicador se mantenha nas três partições. Em tarefa multirrótulo isso não é imediato: a mesma notícia pode portar três indicadores e pertenceria a três estratos simultaneamente, de modo que o procedimento usual de fatiar cada classe separadamente não se aplica.</w:t>
       </w:r>
     </w:p>
     <w:p>
@@ -2060,7 +2164,46 @@
           <w:b w:val="0"/>
           <w:i w:val="0"/>
         </w:rPr>
-        <w:t>A escolha merece registro porque uma solução aparentemente mais correta falha. Estratificar separadamente por cada par de rótulo binário e motivação produz, com quinze categorias, um grande número de estratos com um ou dois exemplos. Como um estrato pequeno não pode ser repartido em três, ele é atribuído integralmente ao treino, e o efeito agregado é esvaziar validação e teste da classe positiva. A intercalação preserva a proporção binária exata, espalha as motivações entre as partições e garante que nenhuma categoria fique sem exemplo de treino, por ordenar a sequência começando pelo treino.</w:t>
+        <w:t>Duas soluções intuitivas foram descartadas, e o registro da razão importa porque a segunda é silenciosamente defeituosa. A primeira é tratar a combinação de indicadores como estrato; com 7 indicadores existem, em princípio, dezenas de combinações observáveis, quase todas com um ou dois exemplos, e um estrato de um exemplo recai integralmente sobre uma partição. A segunda é embaralhar essas combinações e percorrê-las em paralelo, formando uma sequência em que o primeiro exemplo de cada combinação precede o segundo de qualquer outra, para então cortar a sequência nas proporções desejadas. O procedimento parece distribuir os estratos pequenos, mas produz o efeito oposto: como o início da sequência recebe um exemplo de cada combinação, o corte inicial — o treino — absorve todos os estratos pequenos por inteiro, e a cauda da sequência, de onde saem validação e teste, contém apenas os estratos grandes. O resultado observado em verificação empírica foi o esvaziamento completo dos indicadores raros nas duas partições de avaliação.</w:t>
+      </w:r>
+    </w:p>
+    <w:p>
+      <w:pPr>
+        <w:spacing w:after="120"/>
+        <w:ind w:firstLine="709"/>
+      </w:pPr>
+      <w:r>
+        <w:rPr>
+          <w:b w:val="0"/>
+          <w:i w:val="0"/>
+        </w:rPr>
+        <w:t>Adota-se, em lugar disso, a estratificação iterativa para dados multirrótulo, no formato proposto por Sechidis, Tsoumakas e Vlahavas (2011). Cada partição recebe uma cota global e uma cota por indicador, ambas proporcionais ao tamanho pretendido. As notícias são distribuídas uma a uma, e a ordem de atendimento é determinada pelo indicador com menor número de exemplos ainda não distribuídos: cada notícia que o contém é encaminhada à partição com maior cota remanescente naquele indicador, descontando-se em seguida a cota de todos os indicadores que a notícia porta. Atender primeiro o indicador mais raro é o que faz os seus poucos exemplos serem repartidos entre as três partições em vez de se concentrarem na primeira. A partição que já completou a sua cota global é excluída da disputa, o que mantém os tamanhos das partições aderentes às proporções pretendidas.</w:t>
+      </w:r>
+    </w:p>
+    <w:p>
+      <w:pPr>
+        <w:spacing w:after="120"/>
+        <w:ind w:firstLine="709"/>
+      </w:pPr>
+      <w:r>
+        <w:rPr>
+          <w:b w:val="0"/>
+          <w:i w:val="0"/>
+        </w:rPr>
+        <w:t>A notícia sem nenhum indicador — o exemplo negativo — é tratada como portadora de um indicador próprio, exclusivo dela. Sem esse artifício, as negativas seriam distribuídas apenas no fim do procedimento, pela cota que restasse, e poderiam concentrar-se em uma única partição; como são elas que ensinam o modelo a não atribuir indicador algum, a sua proporção precisa ser preservada igualmente.</w:t>
+      </w:r>
+    </w:p>
+    <w:p>
+      <w:pPr>
+        <w:spacing w:after="120"/>
+        <w:ind w:firstLine="709"/>
+      </w:pPr>
+      <w:r>
+        <w:rPr>
+          <w:b w:val="0"/>
+          <w:i w:val="0"/>
+        </w:rPr>
+        <w:t>A consequência prática justifica o cuidado. Sem exemplo de um indicador na validação, não há como calibrar o limiar de decisão daquele indicador, e ele permanece no corte neutro, exatamente a condição em que o indicador raro deixa de ser atribuído. Sem exemplo no conjunto de teste, a medida F1 do indicador é reportada como zero com suporte zero, o que se confunde com erro do modelo. A interface de anotação exibe a contagem por indicador em cada partição justamente para que essas duas situações sejam visíveis antes do treino.</w:t>
       </w:r>
     </w:p>
     <w:p>
@@ -2094,7 +2237,15 @@
         <w:pStyle w:val="Heading1"/>
       </w:pPr>
       <w:r>
-        <w:t>7 Passo 4: modelos comparados</w:t>
+        <w:t>7 Passo 4: modelos comparados e estratégias de ajuste</w:t>
+      </w:r>
+    </w:p>
+    <w:p>
+      <w:pPr>
+        <w:pStyle w:val="Heading2"/>
+      </w:pPr>
+      <w:r>
+        <w:t>7.1 Modelos pré-treinados</w:t>
       </w:r>
     </w:p>
     <w:p>
@@ -2107,7 +2258,7 @@
           <w:b w:val="0"/>
           <w:i w:val="0"/>
         </w:rPr>
-        <w:t>A comparação abrange seis modelos pré-treinados, escolhidos para cobrir três eixos de variação: a oposição entre modelos monolíngues de português e multilíngues, o efeito do tamanho do modelo e o efeito da destilação.</w:t>
+        <w:t>A comparação abrange 3 modelos pré-treinados, todos monolíngues de português, conforme a premissa registrada na seção 2.3. A variação coberta é, portanto, o efeito do tamanho do modelo e a diferença entre as duas famílias disponíveis para o idioma.</w:t>
       </w:r>
     </w:p>
     <w:p>
@@ -2449,10 +2600,189 @@
           </w:p>
         </w:tc>
       </w:tr>
+    </w:tbl>
+    <w:p>
+      <w:pPr>
+        <w:spacing w:before="40" w:after="240" w:line="240" w:lineRule="auto"/>
+        <w:jc w:val="left"/>
+      </w:pPr>
+      <w:r>
+        <w:rPr>
+          <w:color w:val="444444"/>
+          <w:sz w:val="20"/>
+        </w:rPr>
+        <w:t>Tabela 3 — Modelos submetidos à comparação.</w:t>
+      </w:r>
+    </w:p>
+    <w:p>
+      <w:pPr>
+        <w:spacing w:after="120"/>
+        <w:ind w:firstLine="709"/>
+      </w:pPr>
+      <w:r>
+        <w:rPr>
+          <w:b w:val="0"/>
+          <w:i w:val="0"/>
+        </w:rPr>
+        <w:t>A inclusão de duas variantes de tamanho da mesma família — BERTimbau base e large — permite isolar o efeito da escala, uma vez que o corpus e o procedimento de pré-treinamento são os mesmos. A Albertina PT-BR, de porte comparável à variante base mas pré-treinada sobre corpora distintos e especificamente de português do Brasil, fornece o contraste entre famílias. Se a variante base alcançar desempenho próximo ao da variante large, a escolha de implementação passa a ser decidida por custo de inferência e memória, e não por qualidade — observação relevante porque a variante large é também a que corre maior risco de não caber na memória disponível.</w:t>
+      </w:r>
+    </w:p>
+    <w:p>
+      <w:pPr>
+        <w:spacing w:after="120"/>
+        <w:ind w:firstLine="709"/>
+      </w:pPr>
+      <w:r>
+        <w:rPr>
+          <w:b w:val="0"/>
+          <w:i w:val="0"/>
+        </w:rPr>
+        <w:t>Modelos cujo treino não se complete — por exemplo, por insuficiência de memória da unidade de processamento gráfico nas configurações de maior comprimento de sequência — têm a falha registrada com a respectiva mensagem. A informação integra o resultado: um modelo que não cabe no equipamento disponível é um achado de viabilidade, e omiti-lo da tabela daria a entender que não foi avaliado.</w:t>
+      </w:r>
+    </w:p>
+    <w:p>
+      <w:pPr>
+        <w:pStyle w:val="Heading2"/>
+      </w:pPr>
+      <w:r>
+        <w:t>7.2 Natureza multirrótulo da tarefa</w:t>
+      </w:r>
+    </w:p>
+    <w:p>
+      <w:pPr>
+        <w:spacing w:after="120"/>
+        <w:ind w:firstLine="709"/>
+      </w:pPr>
+      <w:r>
+        <w:rPr>
+          <w:b w:val="0"/>
+          <w:i w:val="0"/>
+        </w:rPr>
+        <w:t>A tarefa não consiste em atribuir a uma notícia o indicador que melhor a descreve, e sim em decidir, para cada indicador do catálogo, se a notícia o sustenta. Uma ocorrência em que uma adolescente é atingida durante operação policial porta simultaneamente os indicadores de criança ou adolescente baleado, de mulher baleada e de ação policial, e a atribuição de um deles não pode suprimir as demais.</w:t>
+      </w:r>
+    </w:p>
+    <w:p>
+      <w:pPr>
+        <w:spacing w:after="120"/>
+        <w:ind w:firstLine="709"/>
+      </w:pPr>
+      <w:r>
+        <w:rPr>
+          <w:b w:val="0"/>
+          <w:i w:val="0"/>
+        </w:rPr>
+        <w:t>A consequência arquitetural é a escolha da função de ativação da camada de saída. Adota-se uma função logística independente por indicador, e não a função softmax. Sob softmax as pontuações somam um e as classes competem entre si, de modo que atribuir dois indicadores exigiria que um cedesse pontuação ao outro; sob a função logística independente, cada indicador é comparado ao seu próprio limiar e decide isoladamente. A ausência de indicador algum é, por construção, uma resposta válida, e corresponde à notícia fora do escopo de monitoramento. A função de perda correspondente é a entropia cruzada binária aplicada a cada saída.</w:t>
+      </w:r>
+    </w:p>
+    <w:p>
+      <w:pPr>
+        <w:pStyle w:val="Heading2"/>
+      </w:pPr>
+      <w:r>
+        <w:t>7.3 Estratégias de ajuste comparadas</w:t>
+      </w:r>
+    </w:p>
+    <w:p>
+      <w:pPr>
+        <w:spacing w:after="120"/>
+        <w:ind w:firstLine="709"/>
+      </w:pPr>
+      <w:r>
+        <w:rPr>
+          <w:b w:val="0"/>
+          <w:i w:val="0"/>
+        </w:rPr>
+        <w:t>Duas estratégias produzem essa mesma forma de saída, e ambas são implementadas e submetidas à mesma partição de teste, de modo que a escolha entre elas seja resultado medido e não suposição.</w:t>
+      </w:r>
+    </w:p>
+    <w:p>
+      <w:pPr>
+        <w:spacing w:after="120"/>
+        <w:ind w:firstLine="709"/>
+      </w:pPr>
+    </w:p>
+    <w:tbl>
+      <w:tblPr>
+        <w:tblStyle w:val="TableGrid"/>
+        <w:tblW w:type="auto" w:w="0"/>
+        <w:jc w:val="center"/>
+        <w:tblLayout w:type="fixed"/>
+        <w:tblLook w:firstColumn="1" w:firstRow="1" w:lastColumn="0" w:lastRow="0" w:noHBand="0" w:noVBand="1" w:val="04A0"/>
+      </w:tblPr>
+      <w:tblGrid>
+        <w:gridCol w:w="3024"/>
+        <w:gridCol w:w="3024"/>
+        <w:gridCol w:w="3024"/>
+      </w:tblGrid>
+      <w:tr>
+        <w:trPr>
+          <w:tblHeader w:val="true"/>
+        </w:trPr>
+        <w:tc>
+          <w:tcPr>
+            <w:tcW w:type="dxa" w:w="1928"/>
+            <w:shd w:val="clear" w:color="auto" w:fill="E6EAF0"/>
+          </w:tcPr>
+          <w:p>
+            <w:pPr>
+              <w:spacing w:line="240" w:lineRule="auto" w:after="40" w:before="40"/>
+              <w:jc w:val="left"/>
+            </w:pPr>
+            <w:r/>
+            <w:r>
+              <w:rPr>
+                <w:b/>
+                <w:sz w:val="20"/>
+              </w:rPr>
+              <w:t>Estratégia</w:t>
+            </w:r>
+          </w:p>
+        </w:tc>
+        <w:tc>
+          <w:tcPr>
+            <w:tcW w:type="dxa" w:w="4876"/>
+            <w:shd w:val="clear" w:color="auto" w:fill="E6EAF0"/>
+          </w:tcPr>
+          <w:p>
+            <w:pPr>
+              <w:spacing w:line="240" w:lineRule="auto" w:after="40" w:before="40"/>
+              <w:jc w:val="left"/>
+            </w:pPr>
+            <w:r/>
+            <w:r>
+              <w:rPr>
+                <w:b/>
+                <w:sz w:val="20"/>
+              </w:rPr>
+              <w:t>Descrição</w:t>
+            </w:r>
+          </w:p>
+        </w:tc>
+        <w:tc>
+          <w:tcPr>
+            <w:tcW w:type="dxa" w:w="1134"/>
+            <w:shd w:val="clear" w:color="auto" w:fill="E6EAF0"/>
+          </w:tcPr>
+          <w:p>
+            <w:pPr>
+              <w:spacing w:line="240" w:lineRule="auto" w:after="40" w:before="40"/>
+              <w:jc w:val="left"/>
+            </w:pPr>
+            <w:r/>
+            <w:r>
+              <w:rPr>
+                <w:b/>
+                <w:sz w:val="20"/>
+              </w:rPr>
+              <w:t>Redes ajustadas</w:t>
+            </w:r>
+          </w:p>
+        </w:tc>
+      </w:tr>
       <w:tr>
         <w:tc>
           <w:tcPr>
-            <w:tcW w:type="dxa" w:w="2041"/>
+            <w:tcW w:type="dxa" w:w="1928"/>
           </w:tcPr>
           <w:p>
             <w:pPr>
@@ -2465,13 +2795,13 @@
                 <w:b w:val="0"/>
                 <w:sz w:val="20"/>
               </w:rPr>
-              <w:t>xlm-roberta-base</w:t>
+              <w:t>modelo único</w:t>
             </w:r>
           </w:p>
         </w:tc>
         <w:tc>
           <w:tcPr>
-            <w:tcW w:type="dxa" w:w="2268"/>
+            <w:tcW w:type="dxa" w:w="4876"/>
           </w:tcPr>
           <w:p>
             <w:pPr>
@@ -2484,13 +2814,13 @@
                 <w:b w:val="0"/>
                 <w:sz w:val="20"/>
               </w:rPr>
-              <w:t>XLM-RoBERTa base</w:t>
+              <w:t>Uma rede com uma saída logística independente por indicador; o codificador é compartilhado por todos eles.</w:t>
             </w:r>
           </w:p>
         </w:tc>
         <w:tc>
           <w:tcPr>
-            <w:tcW w:type="dxa" w:w="1361"/>
+            <w:tcW w:type="dxa" w:w="1134"/>
           </w:tcPr>
           <w:p>
             <w:pPr>
@@ -2503,13 +2833,15 @@
                 <w:b w:val="0"/>
                 <w:sz w:val="20"/>
               </w:rPr>
-              <w:t>279M</w:t>
+              <w:t>1</w:t>
             </w:r>
           </w:p>
         </w:tc>
+      </w:tr>
+      <w:tr>
         <w:tc>
           <w:tcPr>
-            <w:tcW w:type="dxa" w:w="3402"/>
+            <w:tcW w:type="dxa" w:w="1928"/>
           </w:tcPr>
           <w:p>
             <w:pPr>
@@ -2522,15 +2854,13 @@
                 <w:b w:val="0"/>
                 <w:sz w:val="20"/>
               </w:rPr>
-              <w:t>multilíngue (100 idiomas)</w:t>
+              <w:t>um por indicador</w:t>
             </w:r>
           </w:p>
         </w:tc>
-      </w:tr>
-      <w:tr>
         <w:tc>
           <w:tcPr>
-            <w:tcW w:type="dxa" w:w="2041"/>
+            <w:tcW w:type="dxa" w:w="4876"/>
           </w:tcPr>
           <w:p>
             <w:pPr>
@@ -2543,13 +2873,13 @@
                 <w:b w:val="0"/>
                 <w:sz w:val="20"/>
               </w:rPr>
-              <w:t>mbert</w:t>
+              <w:t>Uma rede binária independente por indicador, no esquema um-contra-resto; as saídas são reunidas em um vetor multirrótulo.</w:t>
             </w:r>
           </w:p>
         </w:tc>
         <w:tc>
           <w:tcPr>
-            <w:tcW w:type="dxa" w:w="2268"/>
+            <w:tcW w:type="dxa" w:w="1134"/>
           </w:tcPr>
           <w:p>
             <w:pPr>
@@ -2562,13 +2892,15 @@
                 <w:b w:val="0"/>
                 <w:sz w:val="20"/>
               </w:rPr>
-              <w:t>mBERT</w:t>
+              <w:t>7</w:t>
             </w:r>
           </w:p>
         </w:tc>
+      </w:tr>
+      <w:tr>
         <w:tc>
           <w:tcPr>
-            <w:tcW w:type="dxa" w:w="1361"/>
+            <w:tcW w:type="dxa" w:w="1928"/>
           </w:tcPr>
           <w:p>
             <w:pPr>
@@ -2581,13 +2913,13 @@
                 <w:b w:val="0"/>
                 <w:sz w:val="20"/>
               </w:rPr>
-              <w:t>178M</w:t>
+              <w:t>comitê por indicador</w:t>
             </w:r>
           </w:p>
         </w:tc>
         <w:tc>
           <w:tcPr>
-            <w:tcW w:type="dxa" w:w="3402"/>
+            <w:tcW w:type="dxa" w:w="4876"/>
           </w:tcPr>
           <w:p>
             <w:pPr>
@@ -2600,15 +2932,13 @@
                 <w:b w:val="0"/>
                 <w:sz w:val="20"/>
               </w:rPr>
-              <w:t>multilíngue (104 idiomas)</w:t>
+              <w:t>3 redes binárias por indicador, uma de cada arquitetura, com decisão por votação: o indicador só é atribuído automaticamente quando a concordância atinge o corte.</w:t>
             </w:r>
           </w:p>
         </w:tc>
-      </w:tr>
-      <w:tr>
         <w:tc>
           <w:tcPr>
-            <w:tcW w:type="dxa" w:w="2041"/>
+            <w:tcW w:type="dxa" w:w="1134"/>
           </w:tcPr>
           <w:p>
             <w:pPr>
@@ -2621,64 +2951,7 @@
                 <w:b w:val="0"/>
                 <w:sz w:val="20"/>
               </w:rPr>
-              <w:t>distilbert-multilingual</w:t>
-            </w:r>
-          </w:p>
-        </w:tc>
-        <w:tc>
-          <w:tcPr>
-            <w:tcW w:type="dxa" w:w="2268"/>
-          </w:tcPr>
-          <w:p>
-            <w:pPr>
-              <w:spacing w:line="240" w:lineRule="auto" w:after="40" w:before="40"/>
-              <w:jc w:val="left"/>
-            </w:pPr>
-            <w:r/>
-            <w:r>
-              <w:rPr>
-                <w:b w:val="0"/>
-                <w:sz w:val="20"/>
-              </w:rPr>
-              <w:t>DistilBERT multilingual</w:t>
-            </w:r>
-          </w:p>
-        </w:tc>
-        <w:tc>
-          <w:tcPr>
-            <w:tcW w:type="dxa" w:w="1361"/>
-          </w:tcPr>
-          <w:p>
-            <w:pPr>
-              <w:spacing w:line="240" w:lineRule="auto" w:after="40" w:before="40"/>
-              <w:jc w:val="left"/>
-            </w:pPr>
-            <w:r/>
-            <w:r>
-              <w:rPr>
-                <w:b w:val="0"/>
-                <w:sz w:val="20"/>
-              </w:rPr>
-              <w:t>134M</w:t>
-            </w:r>
-          </w:p>
-        </w:tc>
-        <w:tc>
-          <w:tcPr>
-            <w:tcW w:type="dxa" w:w="3402"/>
-          </w:tcPr>
-          <w:p>
-            <w:pPr>
-              <w:spacing w:line="240" w:lineRule="auto" w:after="40" w:before="40"/>
-              <w:jc w:val="left"/>
-            </w:pPr>
-            <w:r/>
-            <w:r>
-              <w:rPr>
-                <w:b w:val="0"/>
-                <w:sz w:val="20"/>
-              </w:rPr>
-              <w:t>multilíngue destilado</w:t>
+              <w:t>21</w:t>
             </w:r>
           </w:p>
         </w:tc>
@@ -2694,7 +2967,7 @@
           <w:color w:val="444444"/>
           <w:sz w:val="20"/>
         </w:rPr>
-        <w:t>Tabela 3 — Modelos submetidos à comparação.</w:t>
+        <w:t>Tabela 4 — Estratégias de ajuste submetidas à comparação.</w:t>
       </w:r>
     </w:p>
     <w:p>
@@ -2707,7 +2980,7 @@
           <w:b w:val="0"/>
           <w:i w:val="0"/>
         </w:rPr>
-        <w:t>A inclusão de duas variantes de tamanho da mesma família permite separar o ganho atribuível à escala do ganho atribuível ao idioma do pré-treinamento. A variante destilada fornece o ponto de comparação de custo: se o seu desempenho for próximo ao das variantes completas, a escolha de implementação passa a ser decidida por tempo de inferência, e não por qualidade.</w:t>
+        <w:t>A estratégia de modelo único tem a seu favor o compartilhamento de representação: o que a rede aprende sobre a linguagem do noticiário policial beneficia todos os indicadores ao mesmo tempo, o que é relevante quando o corpus é pequeno. A estratégia de um modelo por indicador tem a seu favor a independência: cada indicador recebe a capacidade integral de uma rede e o seu próprio ponto de parada, e um indicador raro não disputa parâmetros com os frequentes. O custo é proporcional ao número de indicadores, em tempo de treino, em espaço de armazenamento dos pesos e em memória durante a inferência, uma vez que todas as redes precisam estar carregadas para classificar uma única notícia.</w:t>
       </w:r>
     </w:p>
     <w:p>
@@ -2720,7 +2993,127 @@
           <w:b w:val="0"/>
           <w:i w:val="0"/>
         </w:rPr>
-        <w:t>Modelos cujo treino não se complete — por exemplo, por insuficiência de memória da unidade de processamento gráfico nas configurações de maior comprimento de sequência — têm a falha registrada com a respectiva mensagem. A informação integra o resultado: um modelo que não cabe no equipamento disponível é um achado de viabilidade, e omiti-lo da tabela daria a entender que não foi avaliado.</w:t>
+        <w:t>A terceira estratégia submete a mesma notícia a três arquiteturas distintas por indicador e decide por votação, com um limiar calibrado para CADA rede separadamente. Essa separação é deliberada: um limiar comum às três faria com que discordassem menos por construção, e a discordância é o sinal procurado. A decisão resultante tem três faixas, e não duas — nenhum voto encaminha a notícia à revisão humana, voto abaixo do corte gera alerta a ser verificado, e a partir do corte o indicador segue automaticamente. O preço é explícito nas métricas, que reportam a fração de decisões não automáticas ao lado do desempenho.</w:t>
+      </w:r>
+    </w:p>
+    <w:p>
+      <w:pPr>
+        <w:spacing w:after="120"/>
+        <w:ind w:firstLine="709"/>
+      </w:pPr>
+      <w:r>
+        <w:rPr>
+          <w:b w:val="0"/>
+          <w:i w:val="0"/>
+        </w:rPr>
+        <w:t>A viabilidade do comitê depende de um detalhe de implementação: as redes são treinadas e descartadas uma a uma, e na inferência carrega-se apenas o grupo de um indicador por vez. Mantidas todas em memória simultaneamente, as 21 redes excederiam a memória da unidade gráfica utilizada; carregadas em grupo, o pico medido ficou em torno de um quarto dela. O custo transferiu-se para o tempo: a classificação de uma notícia passa a exigir vários ciclos de carregamento.</w:t>
+      </w:r>
+    </w:p>
+    <w:p>
+      <w:pPr>
+        <w:spacing w:after="120"/>
+        <w:ind w:firstLine="709"/>
+      </w:pPr>
+      <w:r>
+        <w:rPr>
+          <w:b w:val="0"/>
+          <w:i w:val="0"/>
+        </w:rPr>
+        <w:t>A comparação entre as estratégias multiplica o número de execuções, razão pela qual é conduzida sobre uma única configuração da grade: com 3 modelos e 4 configurações, a estratégia de modelo único ajusta 12 redes, a de um modelo por indicador ajusta 84, e a de comitê ajusta 84 — esta última uma vez por configuração, e não por modelo, pois emprega os três simultaneamente.</w:t>
+      </w:r>
+    </w:p>
+    <w:p>
+      <w:pPr>
+        <w:pStyle w:val="Heading2"/>
+      </w:pPr>
+      <w:r>
+        <w:t>7.4 Desbalanceamento: ponderação da perda</w:t>
+      </w:r>
+    </w:p>
+    <w:p>
+      <w:pPr>
+        <w:spacing w:after="120"/>
+        <w:ind w:firstLine="709"/>
+      </w:pPr>
+      <w:r>
+        <w:rPr>
+          <w:b w:val="0"/>
+          <w:i w:val="0"/>
+        </w:rPr>
+        <w:t>Os indicadores têm frequências muito distintas no corpus, e o desbalanceamento afeta a classificação multirrótulo de maneira específica. Para um indicador presente em vinte de quatrocentas notícias, a perda de entropia cruzada binária é quase minimizada por um modelo que nunca o atribui: o acerto em trezentos e oitenta exemplos negativos compensa o erro em vinte positivos. O comportamento resultante — atribuir apenas os indicadores frequentes — é frequentemente interpretado como incapacidade do modelo de reconhecer mais de um indicador, quando se trata de um efeito da função de perda.</w:t>
+      </w:r>
+    </w:p>
+    <w:p>
+      <w:pPr>
+        <w:spacing w:after="120"/>
+        <w:ind w:firstLine="709"/>
+      </w:pPr>
+      <w:r>
+        <w:rPr>
+          <w:b w:val="0"/>
+          <w:i w:val="0"/>
+        </w:rPr>
+        <w:t>A correção adotada é a ponderação do termo positivo da perda de cada indicador pela razão entre o número de exemplos negativos e o de positivos daquele indicador no conjunto de treino. A razão é limitada a um teto de 10, pois um indicador com dois exemplos entre quatrocentos receberia peso próximo a duzentos e passaria a responder por quase toda a atualização dos parâmetros, invertendo o problema. Os pesos efetivamente aplicados são registrados junto às métricas da execução.</w:t>
+      </w:r>
+    </w:p>
+    <w:p>
+      <w:pPr>
+        <w:pStyle w:val="Heading2"/>
+      </w:pPr>
+      <w:r>
+        <w:t>7.5 Calibração do limiar de decisão</w:t>
+      </w:r>
+    </w:p>
+    <w:p>
+      <w:pPr>
+        <w:spacing w:after="120"/>
+        <w:ind w:firstLine="709"/>
+      </w:pPr>
+      <w:r>
+        <w:rPr>
+          <w:b w:val="0"/>
+          <w:i w:val="0"/>
+        </w:rPr>
+        <w:t>A segunda correção incide sobre o limiar de decisão. O valor convencional de cinco décimos é adequado quando as classes são equilibradas, mas não quando não são: a saída logística de um indicador raro tende a permanecer abaixo desse valor mesmo nos casos em que o indicador se aplica, de modo que o indicador deixa de ser atribuído ainda que as suas pontuações estejam corretamente ordenadas. Um limiar comum a todos os indicadores impõe, assim, um custo concentrado nos indicadores menos frequentes.</w:t>
+      </w:r>
+    </w:p>
+    <w:p>
+      <w:pPr>
+        <w:spacing w:after="120"/>
+        <w:ind w:firstLine="709"/>
+      </w:pPr>
+      <w:r>
+        <w:rPr>
+          <w:b w:val="0"/>
+          <w:i w:val="0"/>
+        </w:rPr>
+        <w:t>Adota-se um limiar por indicador, obtido por varredura sobre o conjunto de validação, em incrementos de cinco centésimos, selecionando-se o valor que maximiza a medida F1 daquele indicador. Em caso de empate, prefere-se o limiar mais baixo, decisão justificada pela assimetria entre os dois tipos de erro nesta arquitetura: o indicador atribuído indevidamente é submetido ao modelo de linguagem da etapa seguinte, que pode descartá-lo, enquanto o indicador não atribuído não chega a ser avaliado, e a perda é definitiva.</w:t>
+      </w:r>
+    </w:p>
+    <w:p>
+      <w:pPr>
+        <w:spacing w:after="120"/>
+        <w:ind w:firstLine="709"/>
+      </w:pPr>
+      <w:r>
+        <w:rPr>
+          <w:b w:val="0"/>
+          <w:i w:val="0"/>
+        </w:rPr>
+        <w:t>A calibração utiliza exclusivamente o conjunto de validação. Calibrar sobre o conjunto de teste produziria uma estimativa otimista, por selecionar o limiar com conhecimento dos dados sobre os quais o resultado é reportado. Para que o efeito da calibração seja verificável e não apenas afirmado, registra-se junto a cada execução a medida F1 que o mesmo modelo obteria, no mesmo conjunto de teste, com todos os limiares fixados em cinco décimos; a diferença entre os dois valores é o efeito medido do procedimento. O limiar de cada indicador é gravado com os pesos do modelo, pois a decisão de classificação não é reproduzível sem ele.</w:t>
+      </w:r>
+    </w:p>
+    <w:p>
+      <w:pPr>
+        <w:spacing w:after="120"/>
+        <w:ind w:firstLine="709"/>
+      </w:pPr>
+      <w:r>
+        <w:rPr>
+          <w:b w:val="0"/>
+          <w:i w:val="0"/>
+        </w:rPr>
+        <w:t>Indicadores sem exemplo positivo no conjunto de validação não admitem calibração e permanecem no valor convencional, situação que é registrada explicitamente para que o valor não seja lido como resultado de seleção.</w:t>
       </w:r>
     </w:p>
     <w:p>
@@ -2754,7 +3147,7 @@
           <w:b w:val="0"/>
           <w:i w:val="0"/>
         </w:rPr>
-        <w:t>Cada modelo é treinado sob todas as configurações da grade abaixo, totalizando 24 execuções por tarefa.</w:t>
+        <w:t>Cada modelo é treinado sob todas as configurações da grade abaixo, totalizando 12 execuções por tarefa.</w:t>
       </w:r>
     </w:p>
     <w:p>
@@ -3379,7 +3772,7 @@
           <w:color w:val="444444"/>
           <w:sz w:val="20"/>
         </w:rPr>
-        <w:t>Tabela 4 — Grade de hiperparâmetros.</w:t>
+        <w:t>Tabela 5 — Grade de hiperparâmetros.</w:t>
       </w:r>
     </w:p>
     <w:p>
@@ -3499,6 +3892,19 @@
     </w:p>
     <w:p>
       <w:pPr>
+        <w:spacing w:after="120"/>
+        <w:ind w:firstLine="709"/>
+      </w:pPr>
+      <w:r>
+        <w:rPr>
+          <w:b w:val="0"/>
+          <w:i w:val="0"/>
+        </w:rPr>
+        <w:t>Duas grandezas adicionais são registradas por serem específicas desta tarefa. A primeira é a medida F1 que o mesmo modelo obteria, no mesmo conjunto de teste, com todos os limiares fixados em cinco décimos; confrontada com a medida reportada, ela torna verificável o efeito da calibração descrita na seção 7.5. A segunda é o número médio de indicadores atribuídos por notícia, apresentado ao lado do número médio presente no gabarito, acompanhado da contagem de notícias com dois ou mais indicadores e da contagem de notícias sem indicador algum. Essas contagens respondem diretamente à pergunta sobre a capacidade do modelo de atribuir indicadores simultâneos: uma média atribuída sistematicamente inferior à do gabarito indica atribuição insuficiente, e o diagnóstico recai em primeiro lugar sobre o limiar, não sobre a representação aprendida.</w:t>
+      </w:r>
+    </w:p>
+    <w:p>
+      <w:pPr>
         <w:pStyle w:val="Heading2"/>
       </w:pPr>
       <w:r>
@@ -3515,7 +3921,7 @@
           <w:b w:val="0"/>
           <w:i w:val="0"/>
         </w:rPr>
-        <w:t>A tabela a seguir exemplifica a disposição adotada para a tarefa binária, com os quatro resultados possíveis e a sua interpretação no domínio.</w:t>
+        <w:t>Em tarefa multirrótulo não existe matriz única: reporta-se uma matriz 2×2 por indicador, cada uma tratando a presença daquele indicador como problema independente. A tabela a seguir exemplifica a disposição adotada, com os quatro resultados e a sua interpretação no domínio.</w:t>
       </w:r>
     </w:p>
     <w:p>
@@ -3576,7 +3982,7 @@
                 <w:b/>
                 <w:sz w:val="20"/>
               </w:rPr>
-              <w:t>Predito: sem disparo</w:t>
+              <w:t>Predito: indicador ausente</w:t>
             </w:r>
           </w:p>
         </w:tc>
@@ -3596,7 +4002,7 @@
                 <w:b/>
                 <w:sz w:val="20"/>
               </w:rPr>
-              <w:t>Predito: com disparo</w:t>
+              <w:t>Predito: indicador presente</w:t>
             </w:r>
           </w:p>
         </w:tc>
@@ -3617,7 +4023,7 @@
                 <w:b w:val="0"/>
                 <w:sz w:val="20"/>
               </w:rPr>
-              <w:t>Real: sem disparo</w:t>
+              <w:t>Real: ausente</w:t>
             </w:r>
           </w:p>
         </w:tc>
@@ -3636,7 +4042,7 @@
                 <w:b w:val="0"/>
                 <w:sz w:val="20"/>
               </w:rPr>
-              <w:t>Verdadeiro negativo — notícia fora do escopo corretamente descartada.</w:t>
+              <w:t>Verdadeiro negativo — o indicador corretamente não foi atribuído.</w:t>
             </w:r>
           </w:p>
         </w:tc>
@@ -3655,7 +4061,7 @@
                 <w:b w:val="0"/>
                 <w:sz w:val="20"/>
               </w:rPr>
-              <w:t>Falso positivo — notícia fora do escopo admitida; gera chamada de modelo de linguagem desnecessária e pode contaminar o indicador.</w:t>
+              <w:t>Falso positivo — indicador atribuído sem base; a instrução dele viaja no prompt sem necessidade, e o modelo de linguagem pode descartá-lo ao não achar sustentação no texto.</w:t>
             </w:r>
           </w:p>
         </w:tc>
@@ -3676,7 +4082,7 @@
                 <w:b w:val="0"/>
                 <w:sz w:val="20"/>
               </w:rPr>
-              <w:t>Real: com disparo</w:t>
+              <w:t>Real: presente</w:t>
             </w:r>
           </w:p>
         </w:tc>
@@ -3695,7 +4101,7 @@
                 <w:b w:val="0"/>
                 <w:sz w:val="20"/>
               </w:rPr>
-              <w:t>Falso negativo — ocorrência real descartada; o caso simplesmente não entra na base e o indicador é subestimado.</w:t>
+              <w:t>Falso negativo — indicador não atribuído; a instrução dele não viaja, o aprofundamento correspondente não acontece e o indicador final é subestimado.</w:t>
             </w:r>
           </w:p>
         </w:tc>
@@ -3714,7 +4120,7 @@
                 <w:b w:val="0"/>
                 <w:sz w:val="20"/>
               </w:rPr>
-              <w:t>Verdadeiro positivo — ocorrência corretamente encaminhada à segunda etapa.</w:t>
+              <w:t>Verdadeiro positivo — indicador atribuído e encaminhado ao aprofundamento.</w:t>
             </w:r>
           </w:p>
         </w:tc>
@@ -3730,7 +4136,7 @@
           <w:color w:val="444444"/>
           <w:sz w:val="20"/>
         </w:rPr>
-        <w:t>Tabela 5 — Interpretação da matriz de confusão da tarefa de escopo.</w:t>
+        <w:t>Tabela 6 — Interpretação da matriz de confusão de um indicador.</w:t>
       </w:r>
     </w:p>
     <w:p>
@@ -3743,7 +4149,7 @@
           <w:b w:val="0"/>
           <w:i w:val="0"/>
         </w:rPr>
-        <w:t>A assimetria entre os dois tipos de erro é relevante para a escolha operacional do ponto de corte. O falso positivo tem custo de processamento e é passível de correção na etapa seguinte, inclusive pela revisão humana. O falso negativo é mais grave, porque a ocorrência não chega a existir no sistema e o erro não deixa rastro. Essa consideração favorece, para a primeira etapa, a priorização do recall da classe positiva.</w:t>
+        <w:t>A assimetria entre os dois tipos de erro é relevante para a escolha operacional do ponto de corte. O falso positivo é descartável: a instrução daquela classe viaja no prompt, e tanto o modelo de linguagem quanto a revisão humana podem recusá-la. O falso negativo é perda definitiva, porque a classe que não foi marcada não chega a ser avaliada por ninguém. Essa consideração orienta duas decisões do sistema: a priorização do recall na calibração do limiar, que em caso de empate escolhe o corte mais baixo, e o encaminhamento à revisão humana de toda notícia em que nenhum indicador foi marcado.</w:t>
       </w:r>
     </w:p>
     <w:p>
@@ -4018,7 +4424,7 @@
           <w:rFonts w:ascii="Consolas" w:hAnsi="Consolas"/>
           <w:sz w:val="20"/>
         </w:rPr>
-        <w:t># sorteia a divisão e compara os seis modelos na tarefa de escopo</w:t>
+        <w:t># sorteia a divisão e compara os seis modelos</w:t>
       </w:r>
       <w:r>
         <w:br/>
@@ -4028,7 +4434,7 @@
           <w:rFonts w:ascii="Consolas" w:hAnsi="Consolas"/>
           <w:sz w:val="20"/>
         </w:rPr>
-        <w:t>python rodar_treino.py --dividir --tarefa violencia</w:t>
+        <w:t>python rodar_treino.py --dividir</w:t>
       </w:r>
       <w:r>
         <w:br/>
@@ -4047,7 +4453,7 @@
           <w:rFonts w:ascii="Consolas" w:hAnsi="Consolas"/>
           <w:sz w:val="20"/>
         </w:rPr>
-        <w:t># executa as três tarefas em sequência</w:t>
+        <w:t># compara as duas estratégias de ajuste na mesma partição de teste</w:t>
       </w:r>
       <w:r>
         <w:br/>
@@ -4057,7 +4463,36 @@
           <w:rFonts w:ascii="Consolas" w:hAnsi="Consolas"/>
           <w:sz w:val="20"/>
         </w:rPr>
-        <w:t>python rodar_treino.py --tarefa todas</w:t>
+        <w:t>python rodar_treino.py --estrategia ambas --grade 1</w:t>
+      </w:r>
+      <w:r>
+        <w:br/>
+      </w:r>
+      <w:r>
+        <w:rPr>
+          <w:rFonts w:ascii="Consolas" w:hAnsi="Consolas"/>
+          <w:sz w:val="20"/>
+        </w:rPr>
+      </w:r>
+      <w:r>
+        <w:br/>
+      </w:r>
+      <w:r>
+        <w:rPr>
+          <w:rFonts w:ascii="Consolas" w:hAnsi="Consolas"/>
+          <w:sz w:val="20"/>
+        </w:rPr>
+        <w:t># ajusta uma rede binária por indicador</w:t>
+      </w:r>
+      <w:r>
+        <w:br/>
+      </w:r>
+      <w:r>
+        <w:rPr>
+          <w:rFonts w:ascii="Consolas" w:hAnsi="Consolas"/>
+          <w:sz w:val="20"/>
+        </w:rPr>
+        <w:t>python rodar_treino.py --estrategia por_indicador --grade 1</w:t>
       </w:r>
       <w:r>
         <w:br/>
@@ -4086,7 +4521,7 @@
           <w:rFonts w:ascii="Consolas" w:hAnsi="Consolas"/>
           <w:sz w:val="20"/>
         </w:rPr>
-        <w:t>python rodar_treino.py --tarefa violencia --dispositivo cpu</w:t>
+        <w:t>python rodar_treino.py --dispositivo cpu</w:t>
       </w:r>
       <w:r>
         <w:br/>
@@ -4115,7 +4550,36 @@
           <w:rFonts w:ascii="Consolas" w:hAnsi="Consolas"/>
           <w:sz w:val="20"/>
         </w:rPr>
-        <w:t>python rodar_treino.py --tarefa motivacao --modelo bertimbau-base --grade 1</w:t>
+        <w:t>python rodar_treino.py --modelo bertimbau-base --grade 1</w:t>
+      </w:r>
+      <w:r>
+        <w:br/>
+      </w:r>
+      <w:r>
+        <w:rPr>
+          <w:rFonts w:ascii="Consolas" w:hAnsi="Consolas"/>
+          <w:sz w:val="20"/>
+        </w:rPr>
+      </w:r>
+      <w:r>
+        <w:br/>
+      </w:r>
+      <w:r>
+        <w:rPr>
+          <w:rFonts w:ascii="Consolas" w:hAnsi="Consolas"/>
+          <w:sz w:val="20"/>
+        </w:rPr>
+        <w:t># desliga as correções de desbalanceamento, para medir o efeito delas</w:t>
+      </w:r>
+      <w:r>
+        <w:br/>
+      </w:r>
+      <w:r>
+        <w:rPr>
+          <w:rFonts w:ascii="Consolas" w:hAnsi="Consolas"/>
+          <w:sz w:val="20"/>
+        </w:rPr>
+        <w:t>python rodar_treino.py --sem-peso-classes --sem-calibrar-limiar --grade 1</w:t>
       </w:r>
     </w:p>
     <w:p>
@@ -4136,7 +4600,20 @@
           <w:b w:val="0"/>
           <w:i w:val="0"/>
         </w:rPr>
-        <w:t>Cada execução grava uma linha em banco de dados contendo tarefa, modelo, hiperparâmetros, métricas completas, matriz de confusão, histórico por época, tamanho das três partições, duração e dispositivo. Os pesos do melhor modelo de cada tarefa são gravados em disco e utilizados pela interface de teste. O corpus anotado é exportável em planilha, para anexação ao trabalho e verificação independente.</w:t>
+        <w:t>Cada execução grava uma linha em banco de dados contendo tarefa, estratégia de ajuste, modelo, hiperparâmetros, métricas completas, matriz de confusão por indicador, limiar calibrado de cada indicador, histórico por época, tamanho das três partições, número de redes ajustadas, duração e dispositivo. O registro da estratégia e do número de redes é o que permite ler a tabela como comparação entre as duas alternativas, e não como lista de execuções heterogêneas; o registro dos limiares é condição de reprodutibilidade, pois a mesma rede sob outros limiares produz outras métricas.</w:t>
+      </w:r>
+    </w:p>
+    <w:p>
+      <w:pPr>
+        <w:spacing w:after="120"/>
+        <w:ind w:firstLine="709"/>
+      </w:pPr>
+      <w:r>
+        <w:rPr>
+          <w:b w:val="0"/>
+          <w:i w:val="0"/>
+        </w:rPr>
+        <w:t>Os pesos do melhor modelo são gravados em disco acompanhados de um manifesto que declara a estratégia adotada, a ordem dos indicadores, o limiar de cada um e o comprimento máximo de sequência empregado. A ordem dos indicadores é registrada porque define as posições do vetor de saída: um indicador acrescentado ao catálogo após o treino não existe nos pesos, e a leitura do catálogo corrente deslocaria todas as posições. As estratégias coexistem em disco, em diretórios distintos, e o manifesto determina qual delas responde em produção. O corpus anotado é exportável em planilha, para anexação ao trabalho e verificação independente.</w:t>
       </w:r>
     </w:p>
     <w:p>
@@ -4217,7 +4694,7 @@
           <w:b w:val="0"/>
           <w:i w:val="0"/>
         </w:rPr>
-        <w:t>Reportar o total de notícias anotadas, a distribuição entre as classes da tarefa de escopo, a distribuição por categoria de motivação e por indicador, e o tamanho das três partições. Classes com suporte reduzido devem ser identificadas nesta subseção, pois condicionam a leitura das métricas.</w:t>
+        <w:t>Reportar o total de notícias anotadas, a distribuição por indicador, a contagem de notícias sem indicador algum e o tamanho das três partições. Indicadores com suporte reduzido devem ser identificados nesta subseção, pois condicionam a leitura das métricas.</w:t>
       </w:r>
     </w:p>
     <w:p>
@@ -4300,7 +4777,7 @@
                 <w:b/>
                 <w:sz w:val="20"/>
               </w:rPr>
-              <w:t>Com disparo</w:t>
+              <w:t>Com indicador</w:t>
             </w:r>
           </w:p>
         </w:tc>
@@ -4320,7 +4797,7 @@
                 <w:b/>
                 <w:sz w:val="20"/>
               </w:rPr>
-              <w:t>Sem disparo</w:t>
+              <w:t>Sem indicador</w:t>
             </w:r>
           </w:p>
         </w:tc>
@@ -4636,7 +5113,7 @@
           <w:color w:val="444444"/>
           <w:sz w:val="20"/>
         </w:rPr>
-        <w:t>Tabela 6 — Composição do corpus por partição (a preencher).</w:t>
+        <w:t>Tabela 7 — Composição do corpus por partição (a preencher).</w:t>
       </w:r>
     </w:p>
     <w:p>
@@ -4644,7 +5121,7 @@
         <w:pStyle w:val="Heading2"/>
       </w:pPr>
       <w:r>
-        <w:t>12.2 Tarefa de escopo</w:t>
+        <w:t>12.2 Desempenho por modelo e configuração</w:t>
       </w:r>
     </w:p>
     <w:p>
@@ -5290,447 +5767,6 @@
           </w:p>
         </w:tc>
       </w:tr>
-      <w:tr>
-        <w:tc>
-          <w:tcPr>
-            <w:tcW w:type="dxa" w:w="2041"/>
-          </w:tcPr>
-          <w:p>
-            <w:pPr>
-              <w:spacing w:line="240" w:lineRule="auto" w:after="40" w:before="40"/>
-              <w:jc w:val="left"/>
-            </w:pPr>
-            <w:r/>
-            <w:r>
-              <w:rPr>
-                <w:b w:val="0"/>
-                <w:sz w:val="20"/>
-              </w:rPr>
-              <w:t>XLM-RoBERTa base</w:t>
-            </w:r>
-          </w:p>
-        </w:tc>
-        <w:tc>
-          <w:tcPr>
-            <w:tcW w:type="dxa" w:w="907"/>
-          </w:tcPr>
-          <w:p>
-            <w:pPr>
-              <w:spacing w:line="240" w:lineRule="auto" w:after="40" w:before="40"/>
-              <w:jc w:val="left"/>
-            </w:pPr>
-            <w:r/>
-            <w:r>
-              <w:rPr>
-                <w:b w:val="0"/>
-                <w:sz w:val="20"/>
-              </w:rPr>
-            </w:r>
-          </w:p>
-        </w:tc>
-        <w:tc>
-          <w:tcPr>
-            <w:tcW w:type="dxa" w:w="680"/>
-          </w:tcPr>
-          <w:p>
-            <w:pPr>
-              <w:spacing w:line="240" w:lineRule="auto" w:after="40" w:before="40"/>
-              <w:jc w:val="left"/>
-            </w:pPr>
-            <w:r/>
-            <w:r>
-              <w:rPr>
-                <w:b w:val="0"/>
-                <w:sz w:val="20"/>
-              </w:rPr>
-            </w:r>
-          </w:p>
-        </w:tc>
-        <w:tc>
-          <w:tcPr>
-            <w:tcW w:type="dxa" w:w="907"/>
-          </w:tcPr>
-          <w:p>
-            <w:pPr>
-              <w:spacing w:line="240" w:lineRule="auto" w:after="40" w:before="40"/>
-              <w:jc w:val="left"/>
-            </w:pPr>
-            <w:r/>
-            <w:r>
-              <w:rPr>
-                <w:b w:val="0"/>
-                <w:sz w:val="20"/>
-              </w:rPr>
-            </w:r>
-          </w:p>
-        </w:tc>
-        <w:tc>
-          <w:tcPr>
-            <w:tcW w:type="dxa" w:w="1134"/>
-          </w:tcPr>
-          <w:p>
-            <w:pPr>
-              <w:spacing w:line="240" w:lineRule="auto" w:after="40" w:before="40"/>
-              <w:jc w:val="left"/>
-            </w:pPr>
-            <w:r/>
-            <w:r>
-              <w:rPr>
-                <w:b w:val="0"/>
-                <w:sz w:val="20"/>
-              </w:rPr>
-            </w:r>
-          </w:p>
-        </w:tc>
-        <w:tc>
-          <w:tcPr>
-            <w:tcW w:type="dxa" w:w="1020"/>
-          </w:tcPr>
-          <w:p>
-            <w:pPr>
-              <w:spacing w:line="240" w:lineRule="auto" w:after="40" w:before="40"/>
-              <w:jc w:val="left"/>
-            </w:pPr>
-            <w:r/>
-            <w:r>
-              <w:rPr>
-                <w:b w:val="0"/>
-                <w:sz w:val="20"/>
-              </w:rPr>
-            </w:r>
-          </w:p>
-        </w:tc>
-        <w:tc>
-          <w:tcPr>
-            <w:tcW w:type="dxa" w:w="907"/>
-          </w:tcPr>
-          <w:p>
-            <w:pPr>
-              <w:spacing w:line="240" w:lineRule="auto" w:after="40" w:before="40"/>
-              <w:jc w:val="left"/>
-            </w:pPr>
-            <w:r/>
-            <w:r>
-              <w:rPr>
-                <w:b w:val="0"/>
-                <w:sz w:val="20"/>
-              </w:rPr>
-            </w:r>
-          </w:p>
-        </w:tc>
-        <w:tc>
-          <w:tcPr>
-            <w:tcW w:type="dxa" w:w="1134"/>
-          </w:tcPr>
-          <w:p>
-            <w:pPr>
-              <w:spacing w:line="240" w:lineRule="auto" w:after="40" w:before="40"/>
-              <w:jc w:val="left"/>
-            </w:pPr>
-            <w:r/>
-            <w:r>
-              <w:rPr>
-                <w:b w:val="0"/>
-                <w:sz w:val="20"/>
-              </w:rPr>
-            </w:r>
-          </w:p>
-        </w:tc>
-      </w:tr>
-      <w:tr>
-        <w:tc>
-          <w:tcPr>
-            <w:tcW w:type="dxa" w:w="2041"/>
-          </w:tcPr>
-          <w:p>
-            <w:pPr>
-              <w:spacing w:line="240" w:lineRule="auto" w:after="40" w:before="40"/>
-              <w:jc w:val="left"/>
-            </w:pPr>
-            <w:r/>
-            <w:r>
-              <w:rPr>
-                <w:b w:val="0"/>
-                <w:sz w:val="20"/>
-              </w:rPr>
-              <w:t>mBERT</w:t>
-            </w:r>
-          </w:p>
-        </w:tc>
-        <w:tc>
-          <w:tcPr>
-            <w:tcW w:type="dxa" w:w="907"/>
-          </w:tcPr>
-          <w:p>
-            <w:pPr>
-              <w:spacing w:line="240" w:lineRule="auto" w:after="40" w:before="40"/>
-              <w:jc w:val="left"/>
-            </w:pPr>
-            <w:r/>
-            <w:r>
-              <w:rPr>
-                <w:b w:val="0"/>
-                <w:sz w:val="20"/>
-              </w:rPr>
-            </w:r>
-          </w:p>
-        </w:tc>
-        <w:tc>
-          <w:tcPr>
-            <w:tcW w:type="dxa" w:w="680"/>
-          </w:tcPr>
-          <w:p>
-            <w:pPr>
-              <w:spacing w:line="240" w:lineRule="auto" w:after="40" w:before="40"/>
-              <w:jc w:val="left"/>
-            </w:pPr>
-            <w:r/>
-            <w:r>
-              <w:rPr>
-                <w:b w:val="0"/>
-                <w:sz w:val="20"/>
-              </w:rPr>
-            </w:r>
-          </w:p>
-        </w:tc>
-        <w:tc>
-          <w:tcPr>
-            <w:tcW w:type="dxa" w:w="907"/>
-          </w:tcPr>
-          <w:p>
-            <w:pPr>
-              <w:spacing w:line="240" w:lineRule="auto" w:after="40" w:before="40"/>
-              <w:jc w:val="left"/>
-            </w:pPr>
-            <w:r/>
-            <w:r>
-              <w:rPr>
-                <w:b w:val="0"/>
-                <w:sz w:val="20"/>
-              </w:rPr>
-            </w:r>
-          </w:p>
-        </w:tc>
-        <w:tc>
-          <w:tcPr>
-            <w:tcW w:type="dxa" w:w="1134"/>
-          </w:tcPr>
-          <w:p>
-            <w:pPr>
-              <w:spacing w:line="240" w:lineRule="auto" w:after="40" w:before="40"/>
-              <w:jc w:val="left"/>
-            </w:pPr>
-            <w:r/>
-            <w:r>
-              <w:rPr>
-                <w:b w:val="0"/>
-                <w:sz w:val="20"/>
-              </w:rPr>
-            </w:r>
-          </w:p>
-        </w:tc>
-        <w:tc>
-          <w:tcPr>
-            <w:tcW w:type="dxa" w:w="1020"/>
-          </w:tcPr>
-          <w:p>
-            <w:pPr>
-              <w:spacing w:line="240" w:lineRule="auto" w:after="40" w:before="40"/>
-              <w:jc w:val="left"/>
-            </w:pPr>
-            <w:r/>
-            <w:r>
-              <w:rPr>
-                <w:b w:val="0"/>
-                <w:sz w:val="20"/>
-              </w:rPr>
-            </w:r>
-          </w:p>
-        </w:tc>
-        <w:tc>
-          <w:tcPr>
-            <w:tcW w:type="dxa" w:w="907"/>
-          </w:tcPr>
-          <w:p>
-            <w:pPr>
-              <w:spacing w:line="240" w:lineRule="auto" w:after="40" w:before="40"/>
-              <w:jc w:val="left"/>
-            </w:pPr>
-            <w:r/>
-            <w:r>
-              <w:rPr>
-                <w:b w:val="0"/>
-                <w:sz w:val="20"/>
-              </w:rPr>
-            </w:r>
-          </w:p>
-        </w:tc>
-        <w:tc>
-          <w:tcPr>
-            <w:tcW w:type="dxa" w:w="1134"/>
-          </w:tcPr>
-          <w:p>
-            <w:pPr>
-              <w:spacing w:line="240" w:lineRule="auto" w:after="40" w:before="40"/>
-              <w:jc w:val="left"/>
-            </w:pPr>
-            <w:r/>
-            <w:r>
-              <w:rPr>
-                <w:b w:val="0"/>
-                <w:sz w:val="20"/>
-              </w:rPr>
-            </w:r>
-          </w:p>
-        </w:tc>
-      </w:tr>
-      <w:tr>
-        <w:tc>
-          <w:tcPr>
-            <w:tcW w:type="dxa" w:w="2041"/>
-          </w:tcPr>
-          <w:p>
-            <w:pPr>
-              <w:spacing w:line="240" w:lineRule="auto" w:after="40" w:before="40"/>
-              <w:jc w:val="left"/>
-            </w:pPr>
-            <w:r/>
-            <w:r>
-              <w:rPr>
-                <w:b w:val="0"/>
-                <w:sz w:val="20"/>
-              </w:rPr>
-              <w:t>DistilBERT multilingual</w:t>
-            </w:r>
-          </w:p>
-        </w:tc>
-        <w:tc>
-          <w:tcPr>
-            <w:tcW w:type="dxa" w:w="907"/>
-          </w:tcPr>
-          <w:p>
-            <w:pPr>
-              <w:spacing w:line="240" w:lineRule="auto" w:after="40" w:before="40"/>
-              <w:jc w:val="left"/>
-            </w:pPr>
-            <w:r/>
-            <w:r>
-              <w:rPr>
-                <w:b w:val="0"/>
-                <w:sz w:val="20"/>
-              </w:rPr>
-            </w:r>
-          </w:p>
-        </w:tc>
-        <w:tc>
-          <w:tcPr>
-            <w:tcW w:type="dxa" w:w="680"/>
-          </w:tcPr>
-          <w:p>
-            <w:pPr>
-              <w:spacing w:line="240" w:lineRule="auto" w:after="40" w:before="40"/>
-              <w:jc w:val="left"/>
-            </w:pPr>
-            <w:r/>
-            <w:r>
-              <w:rPr>
-                <w:b w:val="0"/>
-                <w:sz w:val="20"/>
-              </w:rPr>
-            </w:r>
-          </w:p>
-        </w:tc>
-        <w:tc>
-          <w:tcPr>
-            <w:tcW w:type="dxa" w:w="907"/>
-          </w:tcPr>
-          <w:p>
-            <w:pPr>
-              <w:spacing w:line="240" w:lineRule="auto" w:after="40" w:before="40"/>
-              <w:jc w:val="left"/>
-            </w:pPr>
-            <w:r/>
-            <w:r>
-              <w:rPr>
-                <w:b w:val="0"/>
-                <w:sz w:val="20"/>
-              </w:rPr>
-            </w:r>
-          </w:p>
-        </w:tc>
-        <w:tc>
-          <w:tcPr>
-            <w:tcW w:type="dxa" w:w="1134"/>
-          </w:tcPr>
-          <w:p>
-            <w:pPr>
-              <w:spacing w:line="240" w:lineRule="auto" w:after="40" w:before="40"/>
-              <w:jc w:val="left"/>
-            </w:pPr>
-            <w:r/>
-            <w:r>
-              <w:rPr>
-                <w:b w:val="0"/>
-                <w:sz w:val="20"/>
-              </w:rPr>
-            </w:r>
-          </w:p>
-        </w:tc>
-        <w:tc>
-          <w:tcPr>
-            <w:tcW w:type="dxa" w:w="1020"/>
-          </w:tcPr>
-          <w:p>
-            <w:pPr>
-              <w:spacing w:line="240" w:lineRule="auto" w:after="40" w:before="40"/>
-              <w:jc w:val="left"/>
-            </w:pPr>
-            <w:r/>
-            <w:r>
-              <w:rPr>
-                <w:b w:val="0"/>
-                <w:sz w:val="20"/>
-              </w:rPr>
-            </w:r>
-          </w:p>
-        </w:tc>
-        <w:tc>
-          <w:tcPr>
-            <w:tcW w:type="dxa" w:w="907"/>
-          </w:tcPr>
-          <w:p>
-            <w:pPr>
-              <w:spacing w:line="240" w:lineRule="auto" w:after="40" w:before="40"/>
-              <w:jc w:val="left"/>
-            </w:pPr>
-            <w:r/>
-            <w:r>
-              <w:rPr>
-                <w:b w:val="0"/>
-                <w:sz w:val="20"/>
-              </w:rPr>
-            </w:r>
-          </w:p>
-        </w:tc>
-        <w:tc>
-          <w:tcPr>
-            <w:tcW w:type="dxa" w:w="1134"/>
-          </w:tcPr>
-          <w:p>
-            <w:pPr>
-              <w:spacing w:line="240" w:lineRule="auto" w:after="40" w:before="40"/>
-              <w:jc w:val="left"/>
-            </w:pPr>
-            <w:r/>
-            <w:r>
-              <w:rPr>
-                <w:b w:val="0"/>
-                <w:sz w:val="20"/>
-              </w:rPr>
-            </w:r>
-          </w:p>
-        </w:tc>
-      </w:tr>
     </w:tbl>
     <w:p>
       <w:pPr>
@@ -5742,7 +5778,7 @@
           <w:color w:val="444444"/>
           <w:sz w:val="20"/>
         </w:rPr>
-        <w:t>Tabela 7 — Desempenho na tarefa de escopo, melhor configuração por modelo (a preencher).</w:t>
+        <w:t>Tabela 8 — Desempenho, melhor configuração por modelo (a preencher).</w:t>
       </w:r>
     </w:p>
     <w:p>
@@ -5750,7 +5786,7 @@
         <w:pStyle w:val="Heading2"/>
       </w:pPr>
       <w:r>
-        <w:t>12.3 Tarefa de motivação</w:t>
+        <w:t>12.3 Desempenho por indicador</w:t>
       </w:r>
     </w:p>
     <w:p>
@@ -5763,7 +5799,7 @@
           <w:b w:val="0"/>
           <w:i w:val="0"/>
         </w:rPr>
-        <w:t>Reportar as mesmas métricas e a matriz de confusão completa das 15 categorias. A análise deve privilegiar os pares de categorias com maior confusão mútua, verificando se correspondem a fronteiras reconhecidamente difíceis do manual de curadoria — hipótese que, se confirmada, indica revisão de critério de anotação em vez de limitação do modelo.</w:t>
+        <w:t>Reportar as médias macro e micro, as métricas por indicador e a matriz 2×2 de cada um, conforme a seção 2.6. A análise deve privilegiar os indicadores com maior taxa de falso negativo e verificar se correspondem a fronteiras reconhecidamente difíceis do manual de curadoria — hipótese que, se confirmada, indica revisão de critério de anotação em vez de limitação do modelo. O suporte de cada indicador no conjunto de teste deve ser reportado ao lado da sua métrica, sem o que a leitura de um F1 isolado é enganosa.</w:t>
       </w:r>
     </w:p>
     <w:p>
@@ -5771,7 +5807,7 @@
         <w:pStyle w:val="Heading2"/>
       </w:pPr>
       <w:r>
-        <w:t>12.4 Tarefa de indicadores</w:t>
+        <w:t>12.4 Comparação entre as estratégias de ajuste</w:t>
       </w:r>
     </w:p>
     <w:p>
@@ -5784,15 +5820,49 @@
           <w:b w:val="0"/>
           <w:i w:val="0"/>
         </w:rPr>
-        <w:t>Reportar as médias macro e micro, as métricas por indicador e a matriz 2×2 de cada um, conforme a seção 2.6.</w:t>
+        <w:t>Reportar, para a mesma partição de teste, as médias macro das 3 estratégias descritas na seção 7.3, acompanhadas do número de redes ajustadas e do tempo total de treino, de modo que o eventual ganho seja confrontado com o seu custo. Reportar também as métricas por indicador em cada estratégia, pois o ganho esperado da independência entre redes concentra-se nos indicadores menos frequentes e pode não aparecer na média.</w:t>
       </w:r>
     </w:p>
     <w:p>
       <w:pPr>
+        <w:spacing w:after="120"/>
+        <w:ind w:firstLine="709"/>
+      </w:pPr>
+      <w:r>
+        <w:rPr>
+          <w:b w:val="0"/>
+          <w:i w:val="0"/>
+        </w:rPr>
+        <w:t>Para a estratégia de comitê, reportar adicionalmente a distribuição da concordância, a fração de decisões encaminhadas à revisão humana e o desempenho que se obteria exigindo unanimidade. Sem esses três números, a comparação com as demais estratégias é desigual: o comitê troca cobertura automática por precisão, e o que ele deixa de decidir não aparece na métrica de quem decide tudo.</w:t>
+      </w:r>
+    </w:p>
+    <w:p>
+      <w:pPr>
         <w:pStyle w:val="Heading2"/>
       </w:pPr>
       <w:r>
-        <w:t>12.5 Contribuição da camada de modelo de linguagem</w:t>
+        <w:t>12.5 Efeito das correções de desbalanceamento</w:t>
+      </w:r>
+    </w:p>
+    <w:p>
+      <w:pPr>
+        <w:spacing w:after="120"/>
+        <w:ind w:firstLine="709"/>
+      </w:pPr>
+      <w:r>
+        <w:rPr>
+          <w:b w:val="0"/>
+          <w:i w:val="0"/>
+        </w:rPr>
+        <w:t>Reportar as médias macro em quatro condições — com e sem ponderação da perda, com e sem calibração do limiar por indicador — e, em cada uma, o número médio de indicadores atribuídos por notícia ao lado do número médio do gabarito. A comparação isola o quanto da atribuição insuficiente de indicadores se deve à função de perda e o quanto se deve ao limiar de decisão, questão distinta da capacidade de representação do modelo.</w:t>
+      </w:r>
+    </w:p>
+    <w:p>
+      <w:pPr>
+        <w:pStyle w:val="Heading2"/>
+      </w:pPr>
+      <w:r>
+        <w:t>12.6 Contribuição da camada de modelo de linguagem</w:t>
       </w:r>
     </w:p>
     <w:p>
@@ -5967,7 +6037,7 @@
           <w:b w:val="0"/>
           <w:i w:val="0"/>
         </w:rPr>
-        <w:t>Como continuidade, destacam-se a anotação dupla com medida de concordância, a ampliação do corpus nas categorias de menor suporte, a avaliação em fontes não representadas no treino e a investigação de técnicas de balanceamento para as categorias raras.</w:t>
+        <w:t>Como continuidade, destacam-se a anotação dupla com medida de concordância, a ampliação do corpus nos indicadores de menor suporte, a avaliação em fontes não representadas no treino, a investigação de técnicas de balanceamento para os indicadores raros e a construção de um conjunto de referência para a etapa de extração — que hoje não tem métrica própria, por não haver gabarito dos campos que o modelo de linguagem preenche.</w:t>
       </w:r>
     </w:p>
     <w:p>
@@ -6044,6 +6114,33 @@
       </w:pPr>
       <w:r>
         <w:t>SOKOLOVA, M.; LAPALME, G. A systematic analysis of performance measures for classification tasks. Information Processing &amp; Management, v. 45, n. 4, 2009.</w:t>
+      </w:r>
+    </w:p>
+    <w:p>
+      <w:pPr>
+        <w:spacing w:line="240" w:lineRule="auto" w:after="200"/>
+        <w:jc w:val="left"/>
+      </w:pPr>
+      <w:r>
+        <w:t>TSOUMAKAS, G.; KATAKIS, I. Multi-label classification: an overview. International Journal of Data Warehousing and Mining, v. 3, n. 3, 2007.</w:t>
+      </w:r>
+    </w:p>
+    <w:p>
+      <w:pPr>
+        <w:spacing w:line="240" w:lineRule="auto" w:after="200"/>
+        <w:jc w:val="left"/>
+      </w:pPr>
+      <w:r>
+        <w:t>SECHIDIS, K.; TSOUMAKAS, G.; VLAHAVAS, I. On the stratification of multi-label data. In: Machine Learning and Knowledge Discovery in Databases (ECML PKDD), 2011.</w:t>
+      </w:r>
+    </w:p>
+    <w:p>
+      <w:pPr>
+        <w:spacing w:line="240" w:lineRule="auto" w:after="200"/>
+        <w:jc w:val="left"/>
+      </w:pPr>
+      <w:r>
+        <w:t>LIPTON, Z. C.; ELKAN, C.; NARAYANASWAMY, B. Optimal thresholding of classifiers to maximize F1 measure. In: Machine Learning and Knowledge Discovery in Databases (ECML PKDD), 2014.</w:t>
       </w:r>
     </w:p>
     <w:p>
@@ -6065,7 +6162,7 @@
         <w:pStyle w:val="Heading1"/>
       </w:pPr>
       <w:r>
-        <w:t>Apêndice A — Categorias de motivação</w:t>
+        <w:t>Apêndice A — Classes do classificador</w:t>
       </w:r>
     </w:p>
     <w:p>
@@ -6078,7 +6175,7 @@
           <w:b w:val="0"/>
           <w:i w:val="0"/>
         </w:rPr>
-        <w:t>Reprodução das definições utilizadas na anotação e no prompt do modelo de linguagem. A coluna de desambiguação registra as fronteiras que mais geram divergência.</w:t>
+        <w:t>Reprodução das definições utilizadas na anotação e no prompt do modelo de linguagem, para os indicadores que o classificador aprende do texto. A coluna de origem registra se a circunstância correspondente depende de o indicador ter sido marcado.</w:t>
       </w:r>
     </w:p>
     <w:p>
@@ -6120,13 +6217,13 @@
                 <w:b/>
                 <w:sz w:val="20"/>
               </w:rPr>
-              <w:t>Categoria</w:t>
+              <w:t>Indicador</w:t>
             </w:r>
           </w:p>
         </w:tc>
         <w:tc>
           <w:tcPr>
-            <w:tcW w:type="dxa" w:w="3685"/>
+            <w:tcW w:type="dxa" w:w="4252"/>
             <w:shd w:val="clear" w:color="auto" w:fill="E6EAF0"/>
           </w:tcPr>
           <w:p>
@@ -6146,7 +6243,7 @@
         </w:tc>
         <w:tc>
           <w:tcPr>
-            <w:tcW w:type="dxa" w:w="3685"/>
+            <w:tcW w:type="dxa" w:w="3118"/>
             <w:shd w:val="clear" w:color="auto" w:fill="E6EAF0"/>
           </w:tcPr>
           <w:p>
@@ -6160,7 +6257,7 @@
                 <w:b/>
                 <w:sz w:val="20"/>
               </w:rPr>
-              <w:t>Desambiguação</w:t>
+              <w:t>Circunstâncias que destrava</w:t>
             </w:r>
           </w:p>
         </w:tc>
@@ -6181,13 +6278,13 @@
                 <w:b w:val="0"/>
                 <w:sz w:val="20"/>
               </w:rPr>
-              <w:t>arrastao</w:t>
+              <w:t>crianca_adolescente_baleado</w:t>
             </w:r>
           </w:p>
         </w:tc>
         <w:tc>
           <w:tcPr>
-            <w:tcW w:type="dxa" w:w="3685"/>
+            <w:tcW w:type="dxa" w:w="4252"/>
           </w:tcPr>
           <w:p>
             <w:pPr>
@@ -6200,13 +6297,13 @@
                 <w:b w:val="0"/>
                 <w:sz w:val="20"/>
               </w:rPr>
-              <w:t>Roubos ou tentativas de roubo contra múltiplas vítimas ou grupos independentes, na mesma ação contínua, no mesmo tempo e local.</w:t>
+              <w:t>Pessoa com menos de 18 anos atingida por disparo de arma de fogo, conforme o ECA (Lei 8.069/1990).</w:t>
             </w:r>
           </w:p>
         </w:tc>
         <w:tc>
           <w:tcPr>
-            <w:tcW w:type="dxa" w:w="3685"/>
+            <w:tcW w:type="dxa" w:w="3118"/>
           </w:tcPr>
           <w:p>
             <w:pPr>
@@ -6219,7 +6316,7 @@
                 <w:b w:val="0"/>
                 <w:sz w:val="20"/>
               </w:rPr>
-              <w:t>Ônibus/van não é arrastão, é roubo_tentativa. Roubos em série com intervalo de tempo são roubos separados, não arrastão.</w:t>
+              <w:t>trajeto_escolar, bala_perdida</w:t>
             </w:r>
           </w:p>
         </w:tc>
@@ -6240,13 +6337,13 @@
                 <w:b w:val="0"/>
                 <w:sz w:val="20"/>
               </w:rPr>
-              <w:t>ataque_a_civis</w:t>
+              <w:t>mulheres_baleadas</w:t>
             </w:r>
           </w:p>
         </w:tc>
         <w:tc>
           <w:tcPr>
-            <w:tcW w:type="dxa" w:w="3685"/>
+            <w:tcW w:type="dxa" w:w="4252"/>
           </w:tcPr>
           <w:p>
             <w:pPr>
@@ -6259,13 +6356,13 @@
                 <w:b w:val="0"/>
                 <w:sz w:val="20"/>
               </w:rPr>
-              <w:t>Disparos direcionados intencionalmente a um local de uso coletivo ou de circulação pública, como bar, escola, praça ou transporte, com ou sem vítimas atingidas.</w:t>
+              <w:t>Pessoa do gênero feminino atingida por disparo de arma de fogo, qualquer que seja a motivação.</w:t>
             </w:r>
           </w:p>
         </w:tc>
         <w:tc>
           <w:tcPr>
-            <w:tcW w:type="dxa" w:w="3685"/>
+            <w:tcW w:type="dxa" w:w="3118"/>
           </w:tcPr>
           <w:p>
             <w:pPr>
@@ -6278,7 +6375,7 @@
                 <w:b w:val="0"/>
                 <w:sz w:val="20"/>
               </w:rPr>
-              <w:t>Bala perdida de confronto alheio segue o confronto de origem. Execução de um alvo específico sem rajada geral é homicidio_tentativa. Assalto com tiro só para intimidar é roubo_tentativa.</w:t>
+              <w:t>feminicidio_tentativa, bala_perdida, agente_seguranca_agressor</w:t>
             </w:r>
           </w:p>
         </w:tc>
@@ -6299,13 +6396,13 @@
                 <w:b w:val="0"/>
                 <w:sz w:val="20"/>
               </w:rPr>
-              <w:t>sequestro_carcere_privado</w:t>
+              <w:t>acao_policial</w:t>
             </w:r>
           </w:p>
         </w:tc>
         <w:tc>
           <w:tcPr>
-            <w:tcW w:type="dxa" w:w="3685"/>
+            <w:tcW w:type="dxa" w:w="4252"/>
           </w:tcPr>
           <w:p>
             <w:pPr>
@@ -6318,13 +6415,13 @@
                 <w:b w:val="0"/>
                 <w:sz w:val="20"/>
               </w:rPr>
-              <w:t>Privação de liberdade é o centro da dinâmica do crime, com disparo envolvido.</w:t>
+              <w:t>Agentes de segurança EM SERVIÇO atuando na cena no momento do disparo, trocando tiros ou sendo alvo. Agente de folga, aposentado ou exonerado atingido fora de uma ação NÃO é ação policial.</w:t>
             </w:r>
           </w:p>
         </w:tc>
         <w:tc>
           <w:tcPr>
-            <w:tcW w:type="dxa" w:w="3685"/>
+            <w:tcW w:type="dxa" w:w="3118"/>
           </w:tcPr>
           <w:p>
             <w:pPr>
@@ -6337,7 +6434,7 @@
                 <w:b w:val="0"/>
                 <w:sz w:val="20"/>
               </w:rPr>
-              <w:t>Só é sequestro se houver retenção além do necessário para o roubo, ou deslocamento forçado da vítima. Refém liberado logo em seguida é roubo_tentativa comum. Refém tomado durante a fuga de outro crime: esse outro crime é o principal, sequestro entra como complementar.</w:t>
+              <w:t>—</w:t>
             </w:r>
           </w:p>
         </w:tc>
@@ -6358,13 +6455,13 @@
                 <w:b w:val="0"/>
                 <w:sz w:val="20"/>
               </w:rPr>
-              <w:t>tortura</w:t>
+              <w:t>crime_organizado</w:t>
             </w:r>
           </w:p>
         </w:tc>
         <w:tc>
           <w:tcPr>
-            <w:tcW w:type="dxa" w:w="3685"/>
+            <w:tcW w:type="dxa" w:w="4252"/>
           </w:tcPr>
           <w:p>
             <w:pPr>
@@ -6377,13 +6474,13 @@
                 <w:b w:val="0"/>
                 <w:sz w:val="20"/>
               </w:rPr>
-              <w:t>Sinais objetivos de sofrimento antes da morte ou dos disparos finais: vítima imobilizada, amarrada ou algemada, tiros em membros como forma de punição, espancamento, queimaduras ou mutilação.</w:t>
+              <w:t>Envolvimento de facção, milícia ou grupo armado estruturado na dinâmica do disparo, incluindo disputa de território.</w:t>
             </w:r>
           </w:p>
         </w:tc>
         <w:tc>
           <w:tcPr>
-            <w:tcW w:type="dxa" w:w="3685"/>
+            <w:tcW w:type="dxa" w:w="3118"/>
           </w:tcPr>
           <w:p>
             <w:pPr>
@@ -6396,7 +6493,7 @@
                 <w:b w:val="0"/>
                 <w:sz w:val="20"/>
               </w:rPr>
-              <w:t>Execução letal sem imobilização prévia, mesmo com muitos tiros, é homicidio_tentativa. Tiro na perna durante fuga ou troca de tiros pertence ao confronto de origem, não é tortura. Um item roubado encontrado perto do corpo ou usado na fuga dos autores não descarta tortura.</w:t>
+              <w:t>tribunal_do_crime</w:t>
             </w:r>
           </w:p>
         </w:tc>
@@ -6417,13 +6514,13 @@
                 <w:b w:val="0"/>
                 <w:sz w:val="20"/>
               </w:rPr>
-              <w:t>acao_operacao_policial</w:t>
+              <w:t>politico_baleado</w:t>
             </w:r>
           </w:p>
         </w:tc>
         <w:tc>
           <w:tcPr>
-            <w:tcW w:type="dxa" w:w="3685"/>
+            <w:tcW w:type="dxa" w:w="4252"/>
           </w:tcPr>
           <w:p>
             <w:pPr>
@@ -6436,13 +6533,13 @@
                 <w:b w:val="0"/>
                 <w:sz w:val="20"/>
               </w:rPr>
-              <w:t>Disparos que ocorrem no momento em que agentes de segurança em serviço estão atuando na cena, trocando tiros ou sendo alvo: polícia militar, civil, federal, rodoviária, guarda municipal armada, força nacional, agentes penitenciários ou forças armadas. Ação é uma resposta de rotina; operação é planejada, com múltiplas equipes ou unidades.</w:t>
+              <w:t>Pessoa com cargo eletivo, candidatura ou pré-candidatura atingida por disparo de arma de fogo (definição reduzida).</w:t>
             </w:r>
           </w:p>
         </w:tc>
         <w:tc>
           <w:tcPr>
-            <w:tcW w:type="dxa" w:w="3685"/>
+            <w:tcW w:type="dxa" w:w="3118"/>
           </w:tcPr>
           <w:p>
             <w:pPr>
@@ -6455,361 +6552,7 @@
                 <w:b w:val="0"/>
                 <w:sz w:val="20"/>
               </w:rPr>
-              <w:t>É principal quando a própria ação ou operação origina os tiros; é complementar quando os agentes reagem a tiros de um crime em andamento na hora, trocando tiros ou sendo alvo. Agentes que chegam só depois, para atender uma ocorrência já encerrada, socorrer vítima, apreender arma/corpo ou investigar, NÃO entram nesta categoria — é preciso ter disparo envolvendo os agentes no momento do fato, não depois dele. Um suspeito ser alvo de operação policial contra tráfico/armas em outro momento, sem relação com o disparo em si, também não entra aqui. Agente de folga, suicídio de agente ou acidente com a própria arma do agente também não entram nesta categoria.</w:t>
-            </w:r>
-          </w:p>
-        </w:tc>
-      </w:tr>
-      <w:tr>
-        <w:tc>
-          <w:tcPr>
-            <w:tcW w:type="dxa" w:w="1701"/>
-          </w:tcPr>
-          <w:p>
-            <w:pPr>
-              <w:spacing w:line="240" w:lineRule="auto" w:after="40" w:before="40"/>
-              <w:jc w:val="left"/>
-            </w:pPr>
-            <w:r/>
-            <w:r>
-              <w:rPr>
-                <w:b w:val="0"/>
-                <w:sz w:val="20"/>
-              </w:rPr>
-              <w:t>disputa</w:t>
-            </w:r>
-          </w:p>
-        </w:tc>
-        <w:tc>
-          <w:tcPr>
-            <w:tcW w:type="dxa" w:w="3685"/>
-          </w:tcPr>
-          <w:p>
-            <w:pPr>
-              <w:spacing w:line="240" w:lineRule="auto" w:after="40" w:before="40"/>
-              <w:jc w:val="left"/>
-            </w:pPr>
-            <w:r/>
-            <w:r>
-              <w:rPr>
-                <w:b w:val="0"/>
-                <w:sz w:val="20"/>
-              </w:rPr>
-              <w:t>Confronto entre grupos armados rivais, como facções ou milícias, ou ataque de um grupo contra outro ou contra território rival, sem agentes de segurança participando do confronto.</w:t>
-            </w:r>
-          </w:p>
-        </w:tc>
-        <w:tc>
-          <w:tcPr>
-            <w:tcW w:type="dxa" w:w="3685"/>
-          </w:tcPr>
-          <w:p>
-            <w:pPr>
-              <w:spacing w:line="240" w:lineRule="auto" w:after="40" w:before="40"/>
-              <w:jc w:val="left"/>
-            </w:pPr>
-            <w:r/>
-            <w:r>
-              <w:rPr>
-                <w:b w:val="0"/>
-                <w:sz w:val="20"/>
-              </w:rPr>
-              <w:t>Com polícia presente no confronto, a categoria vira acao_operacao_policial (principal se foi a operação que originou os tiros, complementar se a disputa entre grupos que originou). Conflito interpessoal comum é briga. Execução de um alvo específico sem confronto entre grupos é homicidio_tentativa.</w:t>
-            </w:r>
-          </w:p>
-        </w:tc>
-      </w:tr>
-      <w:tr>
-        <w:tc>
-          <w:tcPr>
-            <w:tcW w:type="dxa" w:w="1701"/>
-          </w:tcPr>
-          <w:p>
-            <w:pPr>
-              <w:spacing w:line="240" w:lineRule="auto" w:after="40" w:before="40"/>
-              <w:jc w:val="left"/>
-            </w:pPr>
-            <w:r/>
-            <w:r>
-              <w:rPr>
-                <w:b w:val="0"/>
-                <w:sz w:val="20"/>
-              </w:rPr>
-              <w:t>briga</w:t>
-            </w:r>
-          </w:p>
-        </w:tc>
-        <w:tc>
-          <w:tcPr>
-            <w:tcW w:type="dxa" w:w="3685"/>
-          </w:tcPr>
-          <w:p>
-            <w:pPr>
-              <w:spacing w:line="240" w:lineRule="auto" w:after="40" w:before="40"/>
-              <w:jc w:val="left"/>
-            </w:pPr>
-            <w:r/>
-            <w:r>
-              <w:rPr>
-                <w:b w:val="0"/>
-                <w:sz w:val="20"/>
-              </w:rPr>
-              <w:t>Desentendimento interpessoal, por exemplo no trânsito, em bar, festa, entre vizinhos ou entre parceiros, que escala para disparo de arma de fogo.</w:t>
-            </w:r>
-          </w:p>
-        </w:tc>
-        <w:tc>
-          <w:tcPr>
-            <w:tcW w:type="dxa" w:w="3685"/>
-          </w:tcPr>
-          <w:p>
-            <w:pPr>
-              <w:spacing w:line="240" w:lineRule="auto" w:after="40" w:before="40"/>
-              <w:jc w:val="left"/>
-            </w:pPr>
-            <w:r/>
-            <w:r>
-              <w:rPr>
-                <w:b w:val="0"/>
-                <w:sz w:val="20"/>
-              </w:rPr>
-              <w:t>Entre grupos armados disputando território é disputa, não briga. Uma briga que na verdade é uma tentativa de roubo é roubo_tentativa. Violência doméstica com crueldade deliberada é tortura.</w:t>
-            </w:r>
-          </w:p>
-        </w:tc>
-      </w:tr>
-      <w:tr>
-        <w:tc>
-          <w:tcPr>
-            <w:tcW w:type="dxa" w:w="1701"/>
-          </w:tcPr>
-          <w:p>
-            <w:pPr>
-              <w:spacing w:line="240" w:lineRule="auto" w:after="40" w:before="40"/>
-              <w:jc w:val="left"/>
-            </w:pPr>
-            <w:r/>
-            <w:r>
-              <w:rPr>
-                <w:b w:val="0"/>
-                <w:sz w:val="20"/>
-              </w:rPr>
-              <w:t>homicidio_tentativa</w:t>
-            </w:r>
-          </w:p>
-        </w:tc>
-        <w:tc>
-          <w:tcPr>
-            <w:tcW w:type="dxa" w:w="3685"/>
-          </w:tcPr>
-          <w:p>
-            <w:pPr>
-              <w:spacing w:line="240" w:lineRule="auto" w:after="40" w:before="40"/>
-              <w:jc w:val="left"/>
-            </w:pPr>
-            <w:r/>
-            <w:r>
-              <w:rPr>
-                <w:b w:val="0"/>
-                <w:sz w:val="20"/>
-              </w:rPr>
-              <w:t>O motivo dos disparos é matar ou tentar matar uma pessoa determinada, como em execução, emboscada ou atentado, quando não há outro motivo explícito relatado.</w:t>
-            </w:r>
-          </w:p>
-        </w:tc>
-        <w:tc>
-          <w:tcPr>
-            <w:tcW w:type="dxa" w:w="3685"/>
-          </w:tcPr>
-          <w:p>
-            <w:pPr>
-              <w:spacing w:line="240" w:lineRule="auto" w:after="40" w:before="40"/>
-              <w:jc w:val="left"/>
-            </w:pPr>
-            <w:r/>
-            <w:r>
-              <w:rPr>
-                <w:b w:val="0"/>
-                <w:sz w:val="20"/>
-              </w:rPr>
-              <w:t>Uma dinâmica de emboscada ou execução, em que os autores interceptam ou abordam a vítima especificamente, atiram e fogem, já caracteriza intenção de matar mesmo sem o motivo por trás ser conhecido. Com imobilização ou punição prévia é tortura. Com rajada de tiros em espaço coletivo é ataque_a_civis.</w:t>
-            </w:r>
-          </w:p>
-        </w:tc>
-      </w:tr>
-      <w:tr>
-        <w:tc>
-          <w:tcPr>
-            <w:tcW w:type="dxa" w:w="1701"/>
-          </w:tcPr>
-          <w:p>
-            <w:pPr>
-              <w:spacing w:line="240" w:lineRule="auto" w:after="40" w:before="40"/>
-              <w:jc w:val="left"/>
-            </w:pPr>
-            <w:r/>
-            <w:r>
-              <w:rPr>
-                <w:b w:val="0"/>
-                <w:sz w:val="20"/>
-              </w:rPr>
-              <w:t>roubo_tentativa</w:t>
-            </w:r>
-          </w:p>
-        </w:tc>
-        <w:tc>
-          <w:tcPr>
-            <w:tcW w:type="dxa" w:w="3685"/>
-          </w:tcPr>
-          <w:p>
-            <w:pPr>
-              <w:spacing w:line="240" w:lineRule="auto" w:after="40" w:before="40"/>
-              <w:jc w:val="left"/>
-            </w:pPr>
-            <w:r/>
-            <w:r>
-              <w:rPr>
-                <w:b w:val="0"/>
-                <w:sz w:val="20"/>
-              </w:rPr>
-              <w:t>Roubo ou tentativa de roubo de bens contra uma ou poucas pessoas, contra comércio ou contra veículo particular, com disparo de arma de fogo. Exclui roubo a banco, roubo de cargas e a dinâmica coletiva do arrastão.</w:t>
-            </w:r>
-          </w:p>
-        </w:tc>
-        <w:tc>
-          <w:tcPr>
-            <w:tcW w:type="dxa" w:w="3685"/>
-          </w:tcPr>
-          <w:p>
-            <w:pPr>
-              <w:spacing w:line="240" w:lineRule="auto" w:after="40" w:before="40"/>
-              <w:jc w:val="left"/>
-            </w:pPr>
-            <w:r/>
-            <w:r>
-              <w:rPr>
-                <w:b w:val="0"/>
-                <w:sz w:val="20"/>
-              </w:rPr>
-              <w:t>Inclui assalto em ônibus ou van, e a chamada saidinha de banco quando o alvo é a pessoa que acabou de sacar dinheiro, não a agência bancária.</w:t>
-            </w:r>
-          </w:p>
-        </w:tc>
-      </w:tr>
-      <w:tr>
-        <w:tc>
-          <w:tcPr>
-            <w:tcW w:type="dxa" w:w="1701"/>
-          </w:tcPr>
-          <w:p>
-            <w:pPr>
-              <w:spacing w:line="240" w:lineRule="auto" w:after="40" w:before="40"/>
-              <w:jc w:val="left"/>
-            </w:pPr>
-            <w:r/>
-            <w:r>
-              <w:rPr>
-                <w:b w:val="0"/>
-                <w:sz w:val="20"/>
-              </w:rPr>
-              <w:t>roubo_a_banco</w:t>
-            </w:r>
-          </w:p>
-        </w:tc>
-        <w:tc>
-          <w:tcPr>
-            <w:tcW w:type="dxa" w:w="3685"/>
-          </w:tcPr>
-          <w:p>
-            <w:pPr>
-              <w:spacing w:line="240" w:lineRule="auto" w:after="40" w:before="40"/>
-              <w:jc w:val="left"/>
-            </w:pPr>
-            <w:r/>
-            <w:r>
-              <w:rPr>
-                <w:b w:val="0"/>
-                <w:sz w:val="20"/>
-              </w:rPr>
-              <w:t>Roubo ou tentativa de roubo contra instituição bancária ou caixa eletrônico, com disparo de arma de fogo. Inclui explosão de caixa eletrônico acompanhada de disparo, e o chamado novo cangaço.</w:t>
-            </w:r>
-          </w:p>
-        </w:tc>
-        <w:tc>
-          <w:tcPr>
-            <w:tcW w:type="dxa" w:w="3685"/>
-          </w:tcPr>
-          <w:p>
-            <w:pPr>
-              <w:spacing w:line="240" w:lineRule="auto" w:after="40" w:before="40"/>
-              <w:jc w:val="left"/>
-            </w:pPr>
-            <w:r/>
-            <w:r>
-              <w:rPr>
-                <w:b w:val="0"/>
-                <w:sz w:val="20"/>
-              </w:rPr>
-              <w:t>Cliente assaltado ao sair do banco é roubo_tentativa comum, não roubo_a_banco. Ataque a carro-forte é roubo_de_cargas, não roubo_a_banco.</w:t>
-            </w:r>
-          </w:p>
-        </w:tc>
-      </w:tr>
-      <w:tr>
-        <w:tc>
-          <w:tcPr>
-            <w:tcW w:type="dxa" w:w="1701"/>
-          </w:tcPr>
-          <w:p>
-            <w:pPr>
-              <w:spacing w:line="240" w:lineRule="auto" w:after="40" w:before="40"/>
-              <w:jc w:val="left"/>
-            </w:pPr>
-            <w:r/>
-            <w:r>
-              <w:rPr>
-                <w:b w:val="0"/>
-                <w:sz w:val="20"/>
-              </w:rPr>
-              <w:t>roubo_de_cargas</w:t>
-            </w:r>
-          </w:p>
-        </w:tc>
-        <w:tc>
-          <w:tcPr>
-            <w:tcW w:type="dxa" w:w="3685"/>
-          </w:tcPr>
-          <w:p>
-            <w:pPr>
-              <w:spacing w:line="240" w:lineRule="auto" w:after="40" w:before="40"/>
-              <w:jc w:val="left"/>
-            </w:pPr>
-            <w:r/>
-            <w:r>
-              <w:rPr>
-                <w:b w:val="0"/>
-                <w:sz w:val="20"/>
-              </w:rPr>
-              <w:t>Roubo ou tentativa de roubo de carga transportada, em caminhão, carro-forte, embarcação ou centro de distribuição, com disparo de arma de fogo. Ataque a carro-forte é sempre roubo_de_cargas.</w:t>
-            </w:r>
-          </w:p>
-        </w:tc>
-        <w:tc>
-          <w:tcPr>
-            <w:tcW w:type="dxa" w:w="3685"/>
-          </w:tcPr>
-          <w:p>
-            <w:pPr>
-              <w:spacing w:line="240" w:lineRule="auto" w:after="40" w:before="40"/>
-              <w:jc w:val="left"/>
-            </w:pPr>
-            <w:r/>
-            <w:r>
-              <w:rPr>
-                <w:b w:val="0"/>
-                <w:sz w:val="20"/>
-              </w:rPr>
-              <w:t>Interesse apenas no veículo vazio, sem a carga, é roubo_tentativa comum.</w:t>
+              <w:t>—</w:t>
             </w:r>
           </w:p>
         </w:tc>
@@ -6836,7 +6579,7 @@
         </w:tc>
         <w:tc>
           <w:tcPr>
-            <w:tcW w:type="dxa" w:w="3685"/>
+            <w:tcW w:type="dxa" w:w="4252"/>
           </w:tcPr>
           <w:p>
             <w:pPr>
@@ -6849,13 +6592,13 @@
                 <w:b w:val="0"/>
                 <w:sz w:val="20"/>
               </w:rPr>
-              <w:t>Disparo contra si mesmo, consumado ou tentado, incluindo o caso de agente de segurança fora de ação policial.</w:t>
+              <w:t>Disparo autoinfligido com intenção de morte, consumado ou tentado. É circunstância da vítima, não fenômeno da ocorrência.</w:t>
             </w:r>
           </w:p>
         </w:tc>
         <w:tc>
           <w:tcPr>
-            <w:tcW w:type="dxa" w:w="3685"/>
+            <w:tcW w:type="dxa" w:w="3118"/>
           </w:tcPr>
           <w:p>
             <w:pPr>
@@ -6868,7 +6611,7 @@
                 <w:b w:val="0"/>
                 <w:sz w:val="20"/>
               </w:rPr>
-              <w:t>Homicídio seguido do suicídio do autor: homicidio_tentativa é o principal, suicídio entra como complementar. Indício de terceira pessoa envolvida na morte é homicidio_tentativa, não suicídio. Disparo autoinfligido sem intenção de morte é disparo_acidental.</w:t>
+              <w:t>suicidio</w:t>
             </w:r>
           </w:p>
         </w:tc>
@@ -6889,13 +6632,13 @@
                 <w:b w:val="0"/>
                 <w:sz w:val="20"/>
               </w:rPr>
-              <w:t>disparo_acidental</w:t>
+              <w:t>lgbtqiapn</w:t>
             </w:r>
           </w:p>
         </w:tc>
         <w:tc>
           <w:tcPr>
-            <w:tcW w:type="dxa" w:w="3685"/>
+            <w:tcW w:type="dxa" w:w="4252"/>
           </w:tcPr>
           <w:p>
             <w:pPr>
@@ -6908,13 +6651,13 @@
                 <w:b w:val="0"/>
                 <w:sz w:val="20"/>
               </w:rPr>
-              <w:t>Disparo involuntário, por manuseio indevido da arma, limpeza, queda da arma no chão ou criança manipulando a arma.</w:t>
+              <w:t>Vítima identificada como LGBTQIAPN+ pela notícia. É circunstância da vítima, não fenômeno da ocorrência.</w:t>
             </w:r>
           </w:p>
         </w:tc>
         <w:tc>
           <w:tcPr>
-            <w:tcW w:type="dxa" w:w="3685"/>
+            <w:tcW w:type="dxa" w:w="3118"/>
           </w:tcPr>
           <w:p>
             <w:pPr>
@@ -6927,125 +6670,7 @@
                 <w:b w:val="0"/>
                 <w:sz w:val="20"/>
               </w:rPr>
-              <w:t>Bala perdida de um confronto sempre segue o confronto de origem, nunca é disparo_acidental. Tiro para comemorar é tiros_a_esmo, porque é intencional, não involuntário.</w:t>
-            </w:r>
-          </w:p>
-        </w:tc>
-      </w:tr>
-      <w:tr>
-        <w:tc>
-          <w:tcPr>
-            <w:tcW w:type="dxa" w:w="1701"/>
-          </w:tcPr>
-          <w:p>
-            <w:pPr>
-              <w:spacing w:line="240" w:lineRule="auto" w:after="40" w:before="40"/>
-              <w:jc w:val="left"/>
-            </w:pPr>
-            <w:r/>
-            <w:r>
-              <w:rPr>
-                <w:b w:val="0"/>
-                <w:sz w:val="20"/>
-              </w:rPr>
-              <w:t>tiros_a_esmo</w:t>
-            </w:r>
-          </w:p>
-        </w:tc>
-        <w:tc>
-          <w:tcPr>
-            <w:tcW w:type="dxa" w:w="3685"/>
-          </w:tcPr>
-          <w:p>
-            <w:pPr>
-              <w:spacing w:line="240" w:lineRule="auto" w:after="40" w:before="40"/>
-              <w:jc w:val="left"/>
-            </w:pPr>
-            <w:r/>
-            <w:r>
-              <w:rPr>
-                <w:b w:val="0"/>
-                <w:sz w:val="20"/>
-              </w:rPr>
-              <w:t>Disparo intencional sem alvo definido, como tiro para o alto ou tiro de comemoração.</w:t>
-            </w:r>
-          </w:p>
-        </w:tc>
-        <w:tc>
-          <w:tcPr>
-            <w:tcW w:type="dxa" w:w="3685"/>
-          </w:tcPr>
-          <w:p>
-            <w:pPr>
-              <w:spacing w:line="240" w:lineRule="auto" w:after="40" w:before="40"/>
-              <w:jc w:val="left"/>
-            </w:pPr>
-            <w:r/>
-            <w:r>
-              <w:rPr>
-                <w:b w:val="0"/>
-                <w:sz w:val="20"/>
-              </w:rPr>
-              <w:t>Se ferir alguém por acaso, continua sendo tiros_a_esmo. Disparo dirigido a uma pessoa é homicidio_tentativa. Disparo dirigido a um espaço coletivo é ataque_a_civis. Disparo involuntário é disparo_acidental.</w:t>
-            </w:r>
-          </w:p>
-        </w:tc>
-      </w:tr>
-      <w:tr>
-        <w:tc>
-          <w:tcPr>
-            <w:tcW w:type="dxa" w:w="1701"/>
-          </w:tcPr>
-          <w:p>
-            <w:pPr>
-              <w:spacing w:line="240" w:lineRule="auto" w:after="40" w:before="40"/>
-              <w:jc w:val="left"/>
-            </w:pPr>
-            <w:r/>
-            <w:r>
-              <w:rPr>
-                <w:b w:val="0"/>
-                <w:sz w:val="20"/>
-              </w:rPr>
-              <w:t>rebeliao_fuga_presos</w:t>
-            </w:r>
-          </w:p>
-        </w:tc>
-        <w:tc>
-          <w:tcPr>
-            <w:tcW w:type="dxa" w:w="3685"/>
-          </w:tcPr>
-          <w:p>
-            <w:pPr>
-              <w:spacing w:line="240" w:lineRule="auto" w:after="40" w:before="40"/>
-              <w:jc w:val="left"/>
-            </w:pPr>
-            <w:r/>
-            <w:r>
-              <w:rPr>
-                <w:b w:val="0"/>
-                <w:sz w:val="20"/>
-              </w:rPr>
-              <w:t>Disparos dentro de um presídio ou no seu entorno, motivados por rebelião interna ou fuga de presos, incluindo o confronto com agentes durante a contenção.</w:t>
-            </w:r>
-          </w:p>
-        </w:tc>
-        <w:tc>
-          <w:tcPr>
-            <w:tcW w:type="dxa" w:w="3685"/>
-          </w:tcPr>
-          <w:p>
-            <w:pPr>
-              <w:spacing w:line="240" w:lineRule="auto" w:after="40" w:before="40"/>
-              <w:jc w:val="left"/>
-            </w:pPr>
-            <w:r/>
-            <w:r>
-              <w:rPr>
-                <w:b w:val="0"/>
-                <w:sz w:val="20"/>
-              </w:rPr>
-              <w:t>Briga entre agentes penitenciários dentro da unidade é briga ou homicidio_tentativa, não esta categoria. Suicídio de um detento é suicídio. Fuga que vira perseguição fora do presídio soma acao_operacao_policial como complementar.</w:t>
+              <w:t>lgbtqiapn</w:t>
             </w:r>
           </w:p>
         </w:tc>
@@ -7061,7 +6686,7 @@
           <w:color w:val="444444"/>
           <w:sz w:val="20"/>
         </w:rPr>
-        <w:t>Tabela 8 — As 15 categorias de motivação.</w:t>
+        <w:t>Tabela 9 — Os 7 indicadores que o classificador aprende, e as circunstâncias que cada um autoriza o modelo de linguagem a avaliar.</w:t>
       </w:r>
     </w:p>
     <w:p>
@@ -7209,7 +6834,7 @@
                 <w:b w:val="0"/>
                 <w:sz w:val="20"/>
               </w:rPr>
-              <w:t>regra</w:t>
+              <w:t>texto</w:t>
             </w:r>
           </w:p>
         </w:tc>
@@ -7228,7 +6853,7 @@
                 <w:b w:val="0"/>
                 <w:sz w:val="20"/>
               </w:rPr>
-              <w:t>Vítima baleada com menos de 18 anos, conforme o ECA (Lei 8.069/1990).</w:t>
+              <w:t>Pessoa com menos de 18 anos atingida por disparo de arma de fogo, conforme o ECA (Lei 8.069/1990).</w:t>
             </w:r>
           </w:p>
         </w:tc>
@@ -7268,7 +6893,7 @@
                 <w:b w:val="0"/>
                 <w:sz w:val="20"/>
               </w:rPr>
-              <w:t>regra</w:t>
+              <w:t>texto</w:t>
             </w:r>
           </w:p>
         </w:tc>
@@ -7287,7 +6912,7 @@
                 <w:b w:val="0"/>
                 <w:sz w:val="20"/>
               </w:rPr>
-              <w:t>Vítima baleada do gênero feminino.</w:t>
+              <w:t>Pessoa do gênero feminino atingida por disparo de arma de fogo, qualquer que seja a motivação.</w:t>
             </w:r>
           </w:p>
         </w:tc>
@@ -7308,7 +6933,7 @@
                 <w:b w:val="0"/>
                 <w:sz w:val="20"/>
               </w:rPr>
-              <w:t>Vitimização policial</w:t>
+              <w:t>Violência de gênero</w:t>
             </w:r>
           </w:p>
         </w:tc>
@@ -7327,7 +6952,7 @@
                 <w:b w:val="0"/>
                 <w:sz w:val="20"/>
               </w:rPr>
-              <w:t>regra</w:t>
+              <w:t>texto</w:t>
             </w:r>
           </w:p>
         </w:tc>
@@ -7346,125 +6971,7 @@
                 <w:b w:val="0"/>
                 <w:sz w:val="20"/>
               </w:rPr>
-              <w:t>Vítima baleada que é agente de segurança, em serviço ou de folga.</w:t>
-            </w:r>
-          </w:p>
-        </w:tc>
-      </w:tr>
-      <w:tr>
-        <w:tc>
-          <w:tcPr>
-            <w:tcW w:type="dxa" w:w="2381"/>
-          </w:tcPr>
-          <w:p>
-            <w:pPr>
-              <w:spacing w:line="240" w:lineRule="auto" w:after="40" w:before="40"/>
-              <w:jc w:val="left"/>
-            </w:pPr>
-            <w:r/>
-            <w:r>
-              <w:rPr>
-                <w:b w:val="0"/>
-                <w:sz w:val="20"/>
-              </w:rPr>
-              <w:t>Político baleado</w:t>
-            </w:r>
-          </w:p>
-        </w:tc>
-        <w:tc>
-          <w:tcPr>
-            <w:tcW w:type="dxa" w:w="1020"/>
-          </w:tcPr>
-          <w:p>
-            <w:pPr>
-              <w:spacing w:line="240" w:lineRule="auto" w:after="40" w:before="40"/>
-              <w:jc w:val="left"/>
-            </w:pPr>
-            <w:r/>
-            <w:r>
-              <w:rPr>
-                <w:b w:val="0"/>
-                <w:sz w:val="20"/>
-              </w:rPr>
-              <w:t>regra</w:t>
-            </w:r>
-          </w:p>
-        </w:tc>
-        <w:tc>
-          <w:tcPr>
-            <w:tcW w:type="dxa" w:w="5669"/>
-          </w:tcPr>
-          <w:p>
-            <w:pPr>
-              <w:spacing w:line="240" w:lineRule="auto" w:after="40" w:before="40"/>
-              <w:jc w:val="left"/>
-            </w:pPr>
-            <w:r/>
-            <w:r>
-              <w:rPr>
-                <w:b w:val="0"/>
-                <w:sz w:val="20"/>
-              </w:rPr>
-              <w:t>Vítima baleada com cargo eletivo, função política ou candidatura.</w:t>
-            </w:r>
-          </w:p>
-        </w:tc>
-      </w:tr>
-      <w:tr>
-        <w:tc>
-          <w:tcPr>
-            <w:tcW w:type="dxa" w:w="2381"/>
-          </w:tcPr>
-          <w:p>
-            <w:pPr>
-              <w:spacing w:line="240" w:lineRule="auto" w:after="40" w:before="40"/>
-              <w:jc w:val="left"/>
-            </w:pPr>
-            <w:r/>
-            <w:r>
-              <w:rPr>
-                <w:b w:val="0"/>
-                <w:sz w:val="20"/>
-              </w:rPr>
-              <w:t>Chacina</w:t>
-            </w:r>
-          </w:p>
-        </w:tc>
-        <w:tc>
-          <w:tcPr>
-            <w:tcW w:type="dxa" w:w="1020"/>
-          </w:tcPr>
-          <w:p>
-            <w:pPr>
-              <w:spacing w:line="240" w:lineRule="auto" w:after="40" w:before="40"/>
-              <w:jc w:val="left"/>
-            </w:pPr>
-            <w:r/>
-            <w:r>
-              <w:rPr>
-                <w:b w:val="0"/>
-                <w:sz w:val="20"/>
-              </w:rPr>
-              <w:t>regra</w:t>
-            </w:r>
-          </w:p>
-        </w:tc>
-        <w:tc>
-          <w:tcPr>
-            <w:tcW w:type="dxa" w:w="5669"/>
-          </w:tcPr>
-          <w:p>
-            <w:pPr>
-              <w:spacing w:line="240" w:lineRule="auto" w:after="40" w:before="40"/>
-              <w:jc w:val="left"/>
-            </w:pPr>
-            <w:r/>
-            <w:r>
-              <w:rPr>
-                <w:b w:val="0"/>
-                <w:sz w:val="20"/>
-              </w:rPr>
-              <w:t>Três ou mais pessoas mortas na mesma ocorrência.</w:t>
+              <w:t>Disparo motivado pela condição de gênero da vítima, incluindo feminicídio, violência doméstica e LGBTfobia. Decidido pela LLM: não tem classe própria no BERT, é avaliado dentro dos blocos de mulheres_baleadas e lgbtqiapn.</w:t>
             </w:r>
           </w:p>
         </w:tc>
@@ -7523,7 +7030,66 @@
                 <w:b w:val="0"/>
                 <w:sz w:val="20"/>
               </w:rPr>
-              <w:t>Agentes de segurança em serviço atuando na cena no momento do disparo, trocando tiros ou sendo alvo.</w:t>
+              <w:t>Agentes de segurança EM SERVIÇO atuando na cena no momento do disparo, trocando tiros ou sendo alvo. Agente de folga, aposentado ou exonerado atingido fora de uma ação NÃO é ação policial.</w:t>
+            </w:r>
+          </w:p>
+        </w:tc>
+      </w:tr>
+      <w:tr>
+        <w:tc>
+          <w:tcPr>
+            <w:tcW w:type="dxa" w:w="2381"/>
+          </w:tcPr>
+          <w:p>
+            <w:pPr>
+              <w:spacing w:line="240" w:lineRule="auto" w:after="40" w:before="40"/>
+              <w:jc w:val="left"/>
+            </w:pPr>
+            <w:r/>
+            <w:r>
+              <w:rPr>
+                <w:b w:val="0"/>
+                <w:sz w:val="20"/>
+              </w:rPr>
+              <w:t>Vitimização policial</w:t>
+            </w:r>
+          </w:p>
+        </w:tc>
+        <w:tc>
+          <w:tcPr>
+            <w:tcW w:type="dxa" w:w="1020"/>
+          </w:tcPr>
+          <w:p>
+            <w:pPr>
+              <w:spacing w:line="240" w:lineRule="auto" w:after="40" w:before="40"/>
+              <w:jc w:val="left"/>
+            </w:pPr>
+            <w:r/>
+            <w:r>
+              <w:rPr>
+                <w:b w:val="0"/>
+                <w:sz w:val="20"/>
+              </w:rPr>
+              <w:t>texto</w:t>
+            </w:r>
+          </w:p>
+        </w:tc>
+        <w:tc>
+          <w:tcPr>
+            <w:tcW w:type="dxa" w:w="5669"/>
+          </w:tcPr>
+          <w:p>
+            <w:pPr>
+              <w:spacing w:line="240" w:lineRule="auto" w:after="40" w:before="40"/>
+              <w:jc w:val="left"/>
+            </w:pPr>
+            <w:r/>
+            <w:r>
+              <w:rPr>
+                <w:b w:val="0"/>
+                <w:sz w:val="20"/>
+              </w:rPr>
+              <w:t>Agente de segurança atingido por disparo. Calculado pelo sistema: marcado sempre que alguma vítima tem o tipo `agente`, que a LLM preenche ao montar a lista de vítimas.</w:t>
             </w:r>
           </w:p>
         </w:tc>
@@ -7603,7 +7169,7 @@
                 <w:b w:val="0"/>
                 <w:sz w:val="20"/>
               </w:rPr>
-              <w:t>Violência de gênero</w:t>
+              <w:t>Chacina</w:t>
             </w:r>
           </w:p>
         </w:tc>
@@ -7641,7 +7207,184 @@
                 <w:b w:val="0"/>
                 <w:sz w:val="20"/>
               </w:rPr>
-              <w:t>Disparo motivado pela condição de gênero da vítima, incluindo feminicídio e violência doméstica praticada por parceiro ou ex-parceiro.</w:t>
+              <w:t>Três ou mais pessoas mortas por disparo na mesma ocorrência. Calculado pelo sistema sobre a lista final de vítimas, e reavaliado quando um ferido morre semanas depois.</w:t>
+            </w:r>
+          </w:p>
+        </w:tc>
+      </w:tr>
+      <w:tr>
+        <w:tc>
+          <w:tcPr>
+            <w:tcW w:type="dxa" w:w="2381"/>
+          </w:tcPr>
+          <w:p>
+            <w:pPr>
+              <w:spacing w:line="240" w:lineRule="auto" w:after="40" w:before="40"/>
+              <w:jc w:val="left"/>
+            </w:pPr>
+            <w:r/>
+            <w:r>
+              <w:rPr>
+                <w:b w:val="0"/>
+                <w:sz w:val="20"/>
+              </w:rPr>
+              <w:t>Político baleado</w:t>
+            </w:r>
+          </w:p>
+        </w:tc>
+        <w:tc>
+          <w:tcPr>
+            <w:tcW w:type="dxa" w:w="1020"/>
+          </w:tcPr>
+          <w:p>
+            <w:pPr>
+              <w:spacing w:line="240" w:lineRule="auto" w:after="40" w:before="40"/>
+              <w:jc w:val="left"/>
+            </w:pPr>
+            <w:r/>
+            <w:r>
+              <w:rPr>
+                <w:b w:val="0"/>
+                <w:sz w:val="20"/>
+              </w:rPr>
+              <w:t>texto</w:t>
+            </w:r>
+          </w:p>
+        </w:tc>
+        <w:tc>
+          <w:tcPr>
+            <w:tcW w:type="dxa" w:w="5669"/>
+          </w:tcPr>
+          <w:p>
+            <w:pPr>
+              <w:spacing w:line="240" w:lineRule="auto" w:after="40" w:before="40"/>
+              <w:jc w:val="left"/>
+            </w:pPr>
+            <w:r/>
+            <w:r>
+              <w:rPr>
+                <w:b w:val="0"/>
+                <w:sz w:val="20"/>
+              </w:rPr>
+              <w:t>Pessoa com cargo eletivo, candidatura ou pré-candidatura atingida por disparo de arma de fogo (definição reduzida).</w:t>
+            </w:r>
+          </w:p>
+        </w:tc>
+      </w:tr>
+      <w:tr>
+        <w:tc>
+          <w:tcPr>
+            <w:tcW w:type="dxa" w:w="2381"/>
+          </w:tcPr>
+          <w:p>
+            <w:pPr>
+              <w:spacing w:line="240" w:lineRule="auto" w:after="40" w:before="40"/>
+              <w:jc w:val="left"/>
+            </w:pPr>
+            <w:r/>
+            <w:r>
+              <w:rPr>
+                <w:b w:val="0"/>
+                <w:sz w:val="20"/>
+              </w:rPr>
+              <w:t>Suicídio</w:t>
+            </w:r>
+          </w:p>
+        </w:tc>
+        <w:tc>
+          <w:tcPr>
+            <w:tcW w:type="dxa" w:w="1020"/>
+          </w:tcPr>
+          <w:p>
+            <w:pPr>
+              <w:spacing w:line="240" w:lineRule="auto" w:after="40" w:before="40"/>
+              <w:jc w:val="left"/>
+            </w:pPr>
+            <w:r/>
+            <w:r>
+              <w:rPr>
+                <w:b w:val="0"/>
+                <w:sz w:val="20"/>
+              </w:rPr>
+              <w:t>texto</w:t>
+            </w:r>
+          </w:p>
+        </w:tc>
+        <w:tc>
+          <w:tcPr>
+            <w:tcW w:type="dxa" w:w="5669"/>
+          </w:tcPr>
+          <w:p>
+            <w:pPr>
+              <w:spacing w:line="240" w:lineRule="auto" w:after="40" w:before="40"/>
+              <w:jc w:val="left"/>
+            </w:pPr>
+            <w:r/>
+            <w:r>
+              <w:rPr>
+                <w:b w:val="0"/>
+                <w:sz w:val="20"/>
+              </w:rPr>
+              <w:t>Disparo autoinfligido com intenção de morte, consumado ou tentado. É circunstância da vítima, não fenômeno da ocorrência.</w:t>
+            </w:r>
+          </w:p>
+        </w:tc>
+      </w:tr>
+      <w:tr>
+        <w:tc>
+          <w:tcPr>
+            <w:tcW w:type="dxa" w:w="2381"/>
+          </w:tcPr>
+          <w:p>
+            <w:pPr>
+              <w:spacing w:line="240" w:lineRule="auto" w:after="40" w:before="40"/>
+              <w:jc w:val="left"/>
+            </w:pPr>
+            <w:r/>
+            <w:r>
+              <w:rPr>
+                <w:b w:val="0"/>
+                <w:sz w:val="20"/>
+              </w:rPr>
+              <w:t>LGBTQIAPN+</w:t>
+            </w:r>
+          </w:p>
+        </w:tc>
+        <w:tc>
+          <w:tcPr>
+            <w:tcW w:type="dxa" w:w="1020"/>
+          </w:tcPr>
+          <w:p>
+            <w:pPr>
+              <w:spacing w:line="240" w:lineRule="auto" w:after="40" w:before="40"/>
+              <w:jc w:val="left"/>
+            </w:pPr>
+            <w:r/>
+            <w:r>
+              <w:rPr>
+                <w:b w:val="0"/>
+                <w:sz w:val="20"/>
+              </w:rPr>
+              <w:t>texto</w:t>
+            </w:r>
+          </w:p>
+        </w:tc>
+        <w:tc>
+          <w:tcPr>
+            <w:tcW w:type="dxa" w:w="5669"/>
+          </w:tcPr>
+          <w:p>
+            <w:pPr>
+              <w:spacing w:line="240" w:lineRule="auto" w:after="40" w:before="40"/>
+              <w:jc w:val="left"/>
+            </w:pPr>
+            <w:r/>
+            <w:r>
+              <w:rPr>
+                <w:b w:val="0"/>
+                <w:sz w:val="20"/>
+              </w:rPr>
+              <w:t>Vítima identificada como LGBTQIAPN+ pela notícia. É circunstância da vítima, não fenômeno da ocorrência.</w:t>
             </w:r>
           </w:p>
         </w:tc>
@@ -7657,7 +7400,7 @@
           <w:color w:val="444444"/>
           <w:sz w:val="20"/>
         </w:rPr>
-        <w:t>Tabela 9 — Indicadores e respectivos critérios.</w:t>
+        <w:t>Tabela 10 — Indicadores e respectivos critérios.</w:t>
       </w:r>
     </w:p>
     <w:p>
@@ -7683,7 +7426,7 @@
           <w:b w:val="0"/>
           <w:i w:val="0"/>
         </w:rPr>
-        <w:t>Os indicadores de texto são os que exigem classificação e, portanto, os que entram na avaliação da segunda etapa. O cadastro de novos indicadores de texto exige exemplos anotados para retreinamento, requisito incorporado ao fluxo da aplicação de gestão.</w:t>
+        <w:t>Os indicadores de texto são os que exigem classificação e, portanto, os que entram na avaliação. O cadastro de um indicador de texto novo exige exemplos anotados para retreinamento, requisito incorporado ao fluxo da aplicação de gestão: a classe criada nasce sem exemplo e o sistema recusa o treino enquanto a classe mais rara não tiver o mínimo para ser representada nas três partições.</w:t>
       </w:r>
     </w:p>
     <w:p>
@@ -7810,7 +7553,7 @@
                 <w:b w:val="0"/>
                 <w:sz w:val="20"/>
               </w:rPr>
-              <w:t>Escopo: sim</w:t>
+              <w:t>No escopo: anotar os indicadores que o texto sustentar</w:t>
             </w:r>
           </w:p>
         </w:tc>
@@ -7850,7 +7593,7 @@
                 <w:b w:val="0"/>
                 <w:sz w:val="20"/>
               </w:rPr>
-              <w:t>Escopo: não</w:t>
+              <w:t>Fora do escopo: nenhum indicador</w:t>
             </w:r>
           </w:p>
         </w:tc>
@@ -7890,7 +7633,7 @@
                 <w:b w:val="0"/>
                 <w:sz w:val="20"/>
               </w:rPr>
-              <w:t>Escopo: não</w:t>
+              <w:t>Fora do escopo: nenhum indicador</w:t>
             </w:r>
           </w:p>
         </w:tc>
@@ -7930,7 +7673,87 @@
                 <w:b w:val="0"/>
                 <w:sz w:val="20"/>
               </w:rPr>
-              <w:t>Escopo: não</w:t>
+              <w:t>Fora do escopo: nenhum indicador</w:t>
+            </w:r>
+          </w:p>
+        </w:tc>
+      </w:tr>
+      <w:tr>
+        <w:tc>
+          <w:tcPr>
+            <w:tcW w:type="dxa" w:w="4535"/>
+          </w:tcPr>
+          <w:p>
+            <w:pPr>
+              <w:spacing w:line="240" w:lineRule="auto" w:after="40" w:before="40"/>
+              <w:jc w:val="left"/>
+            </w:pPr>
+            <w:r/>
+            <w:r>
+              <w:rPr>
+                <w:b w:val="0"/>
+                <w:sz w:val="20"/>
+              </w:rPr>
+              <w:t>Ferido em queda, correria ou mal-estar durante o fato</w:t>
+            </w:r>
+          </w:p>
+        </w:tc>
+        <w:tc>
+          <w:tcPr>
+            <w:tcW w:type="dxa" w:w="4535"/>
+          </w:tcPr>
+          <w:p>
+            <w:pPr>
+              <w:spacing w:line="240" w:lineRule="auto" w:after="40" w:before="40"/>
+              <w:jc w:val="left"/>
+            </w:pPr>
+            <w:r/>
+            <w:r>
+              <w:rPr>
+                <w:b w:val="0"/>
+                <w:sz w:val="20"/>
+              </w:rPr>
+              <w:t>Não é vítima; a notícia pode estar no escopo por outra pessoa atingida</w:t>
+            </w:r>
+          </w:p>
+        </w:tc>
+      </w:tr>
+      <w:tr>
+        <w:tc>
+          <w:tcPr>
+            <w:tcW w:type="dxa" w:w="4535"/>
+          </w:tcPr>
+          <w:p>
+            <w:pPr>
+              <w:spacing w:line="240" w:lineRule="auto" w:after="40" w:before="40"/>
+              <w:jc w:val="left"/>
+            </w:pPr>
+            <w:r/>
+            <w:r>
+              <w:rPr>
+                <w:b w:val="0"/>
+                <w:sz w:val="20"/>
+              </w:rPr>
+              <w:t>Ferido por estilhaço, vidro ou coronhada</w:t>
+            </w:r>
+          </w:p>
+        </w:tc>
+        <w:tc>
+          <w:tcPr>
+            <w:tcW w:type="dxa" w:w="4535"/>
+          </w:tcPr>
+          <w:p>
+            <w:pPr>
+              <w:spacing w:line="240" w:lineRule="auto" w:after="40" w:before="40"/>
+              <w:jc w:val="left"/>
+            </w:pPr>
+            <w:r/>
+            <w:r>
+              <w:rPr>
+                <w:b w:val="0"/>
+                <w:sz w:val="20"/>
+              </w:rPr>
+              <w:t>Não é vítima: o ferimento não é por disparo</w:t>
             </w:r>
           </w:p>
         </w:tc>
@@ -7970,87 +7793,7 @@
                 <w:b w:val="0"/>
                 <w:sz w:val="20"/>
               </w:rPr>
-              <w:t>Escopo: sim; motivação segue o confronto de origem</w:t>
-            </w:r>
-          </w:p>
-        </w:tc>
-      </w:tr>
-      <w:tr>
-        <w:tc>
-          <w:tcPr>
-            <w:tcW w:type="dxa" w:w="4535"/>
-          </w:tcPr>
-          <w:p>
-            <w:pPr>
-              <w:spacing w:line="240" w:lineRule="auto" w:after="40" w:before="40"/>
-              <w:jc w:val="left"/>
-            </w:pPr>
-            <w:r/>
-            <w:r>
-              <w:rPr>
-                <w:b w:val="0"/>
-                <w:sz w:val="20"/>
-              </w:rPr>
-              <w:t>Disparo acidental no manuseio da arma</w:t>
-            </w:r>
-          </w:p>
-        </w:tc>
-        <w:tc>
-          <w:tcPr>
-            <w:tcW w:type="dxa" w:w="4535"/>
-          </w:tcPr>
-          <w:p>
-            <w:pPr>
-              <w:spacing w:line="240" w:lineRule="auto" w:after="40" w:before="40"/>
-              <w:jc w:val="left"/>
-            </w:pPr>
-            <w:r/>
-            <w:r>
-              <w:rPr>
-                <w:b w:val="0"/>
-                <w:sz w:val="20"/>
-              </w:rPr>
-              <w:t>Escopo: sim; motivação disparo_acidental</w:t>
-            </w:r>
-          </w:p>
-        </w:tc>
-      </w:tr>
-      <w:tr>
-        <w:tc>
-          <w:tcPr>
-            <w:tcW w:type="dxa" w:w="4535"/>
-          </w:tcPr>
-          <w:p>
-            <w:pPr>
-              <w:spacing w:line="240" w:lineRule="auto" w:after="40" w:before="40"/>
-              <w:jc w:val="left"/>
-            </w:pPr>
-            <w:r/>
-            <w:r>
-              <w:rPr>
-                <w:b w:val="0"/>
-                <w:sz w:val="20"/>
-              </w:rPr>
-              <w:t>Tiro para o alto, sem alvo</w:t>
-            </w:r>
-          </w:p>
-        </w:tc>
-        <w:tc>
-          <w:tcPr>
-            <w:tcW w:type="dxa" w:w="4535"/>
-          </w:tcPr>
-          <w:p>
-            <w:pPr>
-              <w:spacing w:line="240" w:lineRule="auto" w:after="40" w:before="40"/>
-              <w:jc w:val="left"/>
-            </w:pPr>
-            <w:r/>
-            <w:r>
-              <w:rPr>
-                <w:b w:val="0"/>
-                <w:sz w:val="20"/>
-              </w:rPr>
-              <w:t>Escopo: sim; motivação tiros_a_esmo</w:t>
+              <w:t>No escopo; a vítima recebe a circunstância bala_perdida</w:t>
             </w:r>
           </w:p>
         </w:tc>
@@ -8090,7 +7833,7 @@
                 <w:b w:val="0"/>
                 <w:sz w:val="20"/>
               </w:rPr>
-              <w:t>Motivação acao_operacao_policial</w:t>
+              <w:t>Indicador acao_policial</w:t>
             </w:r>
           </w:p>
         </w:tc>
@@ -8130,7 +7873,7 @@
                 <w:b w:val="0"/>
                 <w:sz w:val="20"/>
               </w:rPr>
-              <w:t>Não caracteriza ação policial</w:t>
+              <w:t>NÃO caracteriza ação policial</w:t>
             </w:r>
           </w:p>
         </w:tc>
@@ -8151,7 +7894,7 @@
                 <w:b w:val="0"/>
                 <w:sz w:val="20"/>
               </w:rPr>
-              <w:t>Assalto em que se atira para intimidar</w:t>
+              <w:t>Policial atingido estando de folga</w:t>
             </w:r>
           </w:p>
         </w:tc>
@@ -8170,7 +7913,7 @@
                 <w:b w:val="0"/>
                 <w:sz w:val="20"/>
               </w:rPr>
-              <w:t>Motivação roubo_tentativa, não ataque_a_civis</w:t>
+              <w:t>NÃO é ação policial; é vitimização policial, calculada do tipo da vítima</w:t>
             </w:r>
           </w:p>
         </w:tc>
@@ -8191,7 +7934,7 @@
                 <w:b w:val="0"/>
                 <w:sz w:val="20"/>
               </w:rPr>
-              <w:t>Morte como desfecho de outro motivo relatado</w:t>
+              <w:t>Pessoa com menos de 18 anos atingida</w:t>
             </w:r>
           </w:p>
         </w:tc>
@@ -8210,7 +7953,7 @@
                 <w:b w:val="0"/>
                 <w:sz w:val="20"/>
               </w:rPr>
-              <w:t>O outro motivo é o principal</w:t>
+              <w:t>Indicador derivado da idade; basta registrar a idade ou a palavra criança/adolescente</w:t>
             </w:r>
           </w:p>
         </w:tc>
@@ -8231,7 +7974,7 @@
                 <w:b w:val="0"/>
                 <w:sz w:val="20"/>
               </w:rPr>
-              <w:t>Texto insuficiente para decidir a motivação</w:t>
+              <w:t>Texto insuficiente para decidir um indicador</w:t>
             </w:r>
           </w:p>
         </w:tc>
@@ -8250,7 +7993,7 @@
                 <w:b w:val="0"/>
                 <w:sz w:val="20"/>
               </w:rPr>
-              <w:t>Rotular apenas o escopo; registrar a dúvida na observação</w:t>
+              <w:t>Não marcar o indicador duvidoso; registrar a razão na observação</w:t>
             </w:r>
           </w:p>
         </w:tc>
@@ -8266,7 +8009,7 @@
           <w:color w:val="444444"/>
           <w:sz w:val="20"/>
         </w:rPr>
-        <w:t>Tabela 10 — Diretrizes para casos de fronteira.</w:t>
+        <w:t>Tabela 11 — Diretrizes para casos de fronteira.</w:t>
       </w:r>
     </w:p>
     <w:p>
@@ -8279,7 +8022,7 @@
           <w:b w:val="0"/>
           <w:i w:val="0"/>
         </w:rPr>
-        <w:t>Duas recomendações gerais. Primeiro, a motivação a registrar é a do fato que originou os tiros, e não a do seu desfecho nem de acontecimentos anteriores ou posteriores sem relação com o disparo. Segundo, em caso de dúvida genuína, rotula-se o escopo e deixa-se a motivação em branco, registrando a razão no campo de observação: um rótulo de motivação incerto prejudica mais a segunda tarefa do que a sua ausência.</w:t>
+        <w:t>Três recomendações gerais. Primeiro, considera-se o que envolveu diretamente o disparo, no momento em que ocorreu, e não antecedentes do envolvido nem consequências posteriores que não constituam novo disparo. Segundo, em caso de dúvida genuína sobre um indicador, não o marcar e registrar a razão na observação: um rótulo incerto prejudica mais o treino do que a sua ausência. Terceiro, a notícia que não recebe indicador algum NÃO é descarte — ela é o exemplo negativo, e sem ela o classificador não aprende a recusar o que está fora do escopo.</w:t>
       </w:r>
     </w:p>
     <w:sectPr>

</xml_diff>

<commit_message>
Atualiza numeros da documentacao: 8 classes, 3 modelos, 3 estrategias
B1-B4 corrigem 'sete' classes, '21 redes' (sao 24), 'seis modelos' (sao 3,
com 12 linhas de placar por estrategia) e as listas que citavam duas
estrategias quando ha tres; a tabela de /modelos ganha a linha do cluster.
B5-B6 trocam a unanimidade pelo corte real de 2 de 3 votos, e corrigem as
faixas: 0 ausente, 1 revisao, 2 ou 3 classifica.
B7 lista os seis estados da fila. B8 corrige a afirmacao de que 0 votos
exige revisao: vai para 'arquivo', que nao e pendencia de ninguem.
B9 registra que o minimo de 30 trava o treino desde 14/10, e nao so avisa.
B10 alinha os tamanhos de prompt com o README e separa 'sem modelo
treinado' de 'nenhuma classe marcada'. B11-B13: tabela do agente so viaja
com vitimizacao_policial, retorno de _calibrar_limiares, doze itens de menu.

Co-Authored-By: Claude Opus 5 <noreply@anthropic.com>
</commit_message>
<xml_diff>
--- a/docs/TCC-Classificador-Violencia-Armada.docx
+++ b/docs/TCC-Classificador-Violencia-Armada.docx
@@ -214,7 +214,7 @@
           <w:b w:val="0"/>
           <w:i w:val="0"/>
         </w:rPr>
-        <w:t>Este documento descreve o método, a implementação e o protocolo de avaliação de um sistema que classifica notícias de violência armada em indicadores, substituindo a triagem manual que hoje limita o volume de notícias analisadas e a velocidade de atualização dos indicadores. A classificação é uma tarefa única e multirrótulo: dado o texto, quais dos 7 indicadores a notícia sustenta — podem ser vários ao mesmo tempo, ou nenhum. Não há etapa binária de triagem antes dela: a notícia fora do escopo é justamente a que não recebe indicador algum, e esses exemplos negativos são parte do corpus, não descarte. São comparados 3 modelos pré-treinados monolíngues de português sob uma grade de 4 configurações de hiperparâmetros, em 3 estratégias de ajuste, com relato de acurácia, precisão, recall e medida F1, em versões macro, ponderada e por classe, acompanhadas da matriz de confusão. Um modelo de linguagem de grande porte opera APÓS a marcação e condicionado a ela: ele recebe somente as instruções das classes marcadas, e a sua tarefa é aprofundá-las — montar a lista de vítimas, preencher a ficha de cada uma e as tabelas complementares. O documento detalha a construção do corpus anotado manualmente, o protocolo de divisão amostral, os critérios de seleção de hiperparâmetros e as ameaças à validade dos resultados.</w:t>
+        <w:t>Este documento descreve o método, a implementação e o protocolo de avaliação de um sistema que classifica notícias de violência armada em indicadores, substituindo a triagem manual que hoje limita o volume de notícias analisadas e a velocidade de atualização dos indicadores. A classificação é uma tarefa única e multirrótulo: dado o texto, quais dos 8 indicadores a notícia sustenta — podem ser vários ao mesmo tempo, ou nenhum. Não há etapa binária de triagem antes dela: a notícia fora do escopo é justamente a que não recebe indicador algum, e esses exemplos negativos são parte do corpus, não descarte. São comparados 3 modelos pré-treinados monolíngues de português sob uma grade de 4 configurações de hiperparâmetros, em 3 estratégias de ajuste, com relato de acurácia, precisão, recall e medida F1, em versões macro, ponderada e por classe, acompanhadas da matriz de confusão. Um modelo de linguagem de grande porte opera APÓS a marcação e condicionado a ela: ele recebe somente as instruções das classes marcadas, e a sua tarefa é aprofundá-las — montar a lista de vítimas, preencher a ficha de cada uma e as tabelas complementares. O documento detalha a construção do corpus anotado manualmente, o protocolo de divisão amostral, os critérios de seleção de hiperparâmetros e as ameaças à validade dos resultados.</w:t>
       </w:r>
     </w:p>
     <w:p>
@@ -373,7 +373,7 @@
         <w:ind w:left="709"/>
       </w:pPr>
       <w:r>
-        <w:t>comparar modelos pré-treinados monolíngues de português na atribuição multirrótulo dos 7 indicadores;</w:t>
+        <w:t>comparar modelos pré-treinados monolíngues de português na atribuição multirrótulo dos 8 indicadores;</w:t>
       </w:r>
     </w:p>
     <w:p>
@@ -1006,7 +1006,7 @@
           <w:b w:val="0"/>
           <w:i w:val="0"/>
         </w:rPr>
-        <w:t>A notícia entra por uma fila de recebidas, com o endereço eletrônico, a data informada e o texto integral. O classificador a lê e atribui, a cada indicador, uma decisão que não é binária: na estratégia de comitê, conta-se quantos dos três modelos marcaram aquele indicador, e a notícia é encaminhada conforme a concordância — nenhum voto exige revisão humana, voto isolado gera alerta a ser verificado, e dois ou três seguem adiante. Somente o que segue chega ao modelo de linguagem, e ele recebe apenas as instruções dos indicadores marcados. Sua tarefa é aprofundá-los: montar a lista de pessoas atingidas, preencher a ficha de cada uma e as tabelas complementares. O resultado é gravado com situação “não aprovado” e segue para revisão humana; ao ser aprovado, cada notícia da ocorrência retorna ao corpus como exemplo rotulado, fechando o ciclo de treino.</w:t>
+        <w:t>A notícia entra por uma fila de recebidas, com o endereço eletrônico, a data informada e o texto integral. O classificador a lê e atribui, a cada indicador, uma decisão que não é binária: na estratégia de comitê, conta-se quantos dos três modelos marcaram aquele indicador, e a notícia é encaminhada conforme a concordância — nenhum voto arquiva a notícia como acervo, sem gerar pendência, voto isolado gera alerta a ser verificado, e dois ou três seguem adiante. Somente o que segue chega ao modelo de linguagem, e ele recebe apenas as instruções dos indicadores marcados. Sua tarefa é aprofundá-los: montar a lista de pessoas atingidas, preencher a ficha de cada uma e as tabelas complementares. O resultado é gravado com situação “não aprovado” e segue para revisão humana; ao ser aprovado, cada notícia da ocorrência retorna ao corpus como exemplo rotulado, fechando o ciclo de treino.</w:t>
       </w:r>
     </w:p>
     <w:p>
@@ -1324,7 +1324,7 @@
                 <w:b w:val="0"/>
                 <w:sz w:val="20"/>
               </w:rPr>
-              <w:t>Confirmação do que ficou sem voto ou com voto isolado.</w:t>
+              <w:t>Verificação do que recebeu voto isolado.</w:t>
             </w:r>
           </w:p>
         </w:tc>
@@ -1984,7 +1984,7 @@
           <w:b w:val="0"/>
           <w:i w:val="0"/>
         </w:rPr>
-        <w:t>A fila é ordenada por gravidade, não por data. Quando há modelo treinado, a notícia em que o classificador não marcou indicador algum aparece primeiro, sinalizada em vermelho: é o falso negativo, o erro mais custoso de não examinar, porque o indicador que o classificador não marca não chega a ser avaliado pela etapa seguinte. Em seguida vem o que recebeu voto isolado no comitê, sinalizado em laranja. A rotulagem feita nessa fila alimenta diretamente o corpus, de modo que o trabalho de conferência e o de construção do conjunto de treino são o mesmo trabalho.</w:t>
+        <w:t>A fila é ordenada por pendência, não por data. Aparece primeiro a notícia que recebeu voto isolado no comitê, sinalizada em laranja, e em seguida a que ninguém examinou ainda. A notícia em que nenhum indicador foi marcado não ocupa a fila: fica retida como acervo, ao final da listagem, e é reavaliada quando há modelo novo — o falso negativo não é descartado, mas também não disputa a atenção de quem trabalha a fila. A rotulagem feita nessa fila alimenta diretamente o corpus, de modo que o trabalho de conferência e o de construção do conjunto de treino são o mesmo trabalho.</w:t>
       </w:r>
     </w:p>
     <w:p>
@@ -1997,7 +1997,7 @@
           <w:b w:val="0"/>
           <w:i w:val="0"/>
         </w:rPr>
-        <w:t>A interface informa, por tarefa, se o corpus já sustenta uma medição honesta. O limiar adotado é de 30 exemplos por classe para considerar a métrica estável, e de três exemplos como mínimo absoluto para que a classe possa ser representada nas três partições. O critério é informativo: abaixo de uma dezena de exemplos no conjunto de teste, a variação de um único acerto desloca o recall em dezenas de pontos percentuais, e relatar tal número como resultado seria enganoso.</w:t>
+        <w:t>A interface informa, por tarefa, se o corpus já sustenta uma medição honesta. O limiar adotado é de 30 exemplos por classe para considerar a métrica estável, e de três exemplos como mínimo absoluto para que a classe possa ser representada nas três partições. O critério NÃO é informativo: desde outubro de 2026 o treino é recusado enquanto qualquer classe do conjunto pedido estiver abaixo do mínimo. A razão é que, abaixo de uma dezena de exemplos no conjunto de teste, a variação de um único acerto desloca o recall em dezenas de pontos percentuais, e relatar tal número como resultado seria enganoso. Treinar um subconjunto de classes já maduras continua possível, pela opção --classe, que aplica a trava apenas às classes pedidas.</w:t>
       </w:r>
     </w:p>
     <w:p>
@@ -2018,7 +2018,7 @@
           <w:b w:val="0"/>
           <w:i w:val="0"/>
         </w:rPr>
-        <w:t>São 7 indicadores, e a exigência amostral se conta por indicador, não por notícia: mantendo a ordem de grandeza de algumas dezenas de exemplos positivos de cada um no conjunto de treino, e somando os exemplos sem indicador algum, chega-se à casa das centenas de notícias anotadas. Como a tarefa é multirrótulo, uma mesma notícia contribui para mais de um indicador, o que atenua o total, porém não socorre o indicador raro — que continua dependendo de encontrar notícias em que ele apareça.</w:t>
+        <w:t>São 8 indicadores, e a exigência amostral se conta por indicador, não por notícia: mantendo a ordem de grandeza de algumas dezenas de exemplos positivos de cada um no conjunto de treino, e somando os exemplos sem indicador algum, chega-se à casa das centenas de notícias anotadas. Como a tarefa é multirrótulo, uma mesma notícia contribui para mais de um indicador, o que atenua o total, porém não socorre o indicador raro — que continua dependendo de encontrar notícias em que ele apareça.</w:t>
       </w:r>
     </w:p>
     <w:p>
@@ -2031,7 +2031,7 @@
           <w:b w:val="0"/>
           <w:i w:val="0"/>
         </w:rPr>
-        <w:t>Indicadores raros na realidade — e portanto raros no corpus — devem ser reportados com o seu suporte explícito, e a discussão dos resultados precisa distinguir limitação do modelo de insuficiência amostral. O sistema não permite treinar com menos de três exemplos da classe mais rara, por não haver como representá-la nas três partições, e sinaliza como instável toda classe com menos de 30 exemplos.</w:t>
+        <w:t>Indicadores raros na realidade — e portanto raros no corpus — devem ser reportados com o seu suporte explícito, e a discussão dos resultados precisa distinguir limitação do modelo de insuficiência amostral. O sistema não permite treinar com menos de três exemplos da classe mais rara, por não haver como representá-la nas três partições, e recusa o treino de toda classe com menos de 30 exemplos.</w:t>
       </w:r>
     </w:p>
     <w:p>
@@ -2164,7 +2164,7 @@
           <w:b w:val="0"/>
           <w:i w:val="0"/>
         </w:rPr>
-        <w:t>Duas soluções intuitivas foram descartadas, e o registro da razão importa porque a segunda é silenciosamente defeituosa. A primeira é tratar a combinação de indicadores como estrato; com 7 indicadores existem, em princípio, dezenas de combinações observáveis, quase todas com um ou dois exemplos, e um estrato de um exemplo recai integralmente sobre uma partição. A segunda é embaralhar essas combinações e percorrê-las em paralelo, formando uma sequência em que o primeiro exemplo de cada combinação precede o segundo de qualquer outra, para então cortar a sequência nas proporções desejadas. O procedimento parece distribuir os estratos pequenos, mas produz o efeito oposto: como o início da sequência recebe um exemplo de cada combinação, o corte inicial — o treino — absorve todos os estratos pequenos por inteiro, e a cauda da sequência, de onde saem validação e teste, contém apenas os estratos grandes. O resultado observado em verificação empírica foi o esvaziamento completo dos indicadores raros nas duas partições de avaliação.</w:t>
+        <w:t>Duas soluções intuitivas foram descartadas, e o registro da razão importa porque a segunda é silenciosamente defeituosa. A primeira é tratar a combinação de indicadores como estrato; com 8 indicadores existem, em princípio, dezenas de combinações observáveis, quase todas com um ou dois exemplos, e um estrato de um exemplo recai integralmente sobre uma partição. A segunda é embaralhar essas combinações e percorrê-las em paralelo, formando uma sequência em que o primeiro exemplo de cada combinação precede o segundo de qualquer outra, para então cortar a sequência nas proporções desejadas. O procedimento parece distribuir os estratos pequenos, mas produz o efeito oposto: como o início da sequência recebe um exemplo de cada combinação, o corte inicial — o treino — absorve todos os estratos pequenos por inteiro, e a cauda da sequência, de onde saem validação e teste, contém apenas os estratos grandes. O resultado observado em verificação empírica foi o esvaziamento completo dos indicadores raros nas duas partições de avaliação.</w:t>
       </w:r>
     </w:p>
     <w:p>
@@ -2692,7 +2692,7 @@
           <w:b w:val="0"/>
           <w:i w:val="0"/>
         </w:rPr>
-        <w:t>Duas estratégias produzem essa mesma forma de saída, e ambas são implementadas e submetidas à mesma partição de teste, de modo que a escolha entre elas seja resultado medido e não suposição.</w:t>
+        <w:t>Três estratégias produzem essa mesma forma de saída, e todas são implementadas e submetidas à mesma partição de teste, de modo que a escolha entre elas seja resultado medido e não suposição.</w:t>
       </w:r>
     </w:p>
     <w:p>
@@ -2892,7 +2892,7 @@
                 <w:b w:val="0"/>
                 <w:sz w:val="20"/>
               </w:rPr>
-              <w:t>7</w:t>
+              <w:t>8</w:t>
             </w:r>
           </w:p>
         </w:tc>
@@ -2951,7 +2951,7 @@
                 <w:b w:val="0"/>
                 <w:sz w:val="20"/>
               </w:rPr>
-              <w:t>21</w:t>
+              <w:t>24</w:t>
             </w:r>
           </w:p>
         </w:tc>
@@ -2993,7 +2993,7 @@
           <w:b w:val="0"/>
           <w:i w:val="0"/>
         </w:rPr>
-        <w:t>A terceira estratégia submete a mesma notícia a três arquiteturas distintas por indicador e decide por votação, com um limiar calibrado para CADA rede separadamente. Essa separação é deliberada: um limiar comum às três faria com que discordassem menos por construção, e a discordância é o sinal procurado. A decisão resultante tem três faixas, e não duas — nenhum voto encaminha a notícia à revisão humana, voto abaixo do corte gera alerta a ser verificado, e a partir do corte o indicador segue automaticamente. O preço é explícito nas métricas, que reportam a fração de decisões não automáticas ao lado do desempenho.</w:t>
+        <w:t>A terceira estratégia submete a mesma notícia a três arquiteturas distintas por indicador e decide por votação, com um limiar calibrado para CADA rede separadamente. Essa separação é deliberada: um limiar comum às três faria com que discordassem menos por construção, e a discordância é o sinal procurado. A decisão resultante tem três faixas, e não duas — nenhum voto arquiva a notícia como acervo, sem gerar pendência, voto abaixo do corte gera alerta a ser verificado, e a partir do corte o indicador segue automaticamente. O preço é explícito nas métricas, que reportam a fração de decisões não automáticas ao lado do desempenho.</w:t>
       </w:r>
     </w:p>
     <w:p>
@@ -3006,7 +3006,7 @@
           <w:b w:val="0"/>
           <w:i w:val="0"/>
         </w:rPr>
-        <w:t>A viabilidade do comitê depende de um detalhe de implementação: as redes são treinadas e descartadas uma a uma, e na inferência carrega-se apenas o grupo de um indicador por vez. Mantidas todas em memória simultaneamente, as 21 redes excederiam a memória da unidade gráfica utilizada; carregadas em grupo, o pico medido ficou em torno de um quarto dela. O custo transferiu-se para o tempo: a classificação de uma notícia passa a exigir vários ciclos de carregamento.</w:t>
+        <w:t>A viabilidade do comitê depende de um detalhe de implementação: as redes são treinadas e descartadas uma a uma, e na inferência carrega-se apenas o grupo de um indicador por vez. Mantidas todas em memória simultaneamente, as 24 redes excederiam a memória da unidade gráfica utilizada; carregadas em grupo, o pico medido ficou em torno de um quarto dela. O custo transferiu-se para o tempo: a classificação de uma notícia passa a exigir vários ciclos de carregamento.</w:t>
       </w:r>
     </w:p>
     <w:p>
@@ -3019,7 +3019,7 @@
           <w:b w:val="0"/>
           <w:i w:val="0"/>
         </w:rPr>
-        <w:t>A comparação entre as estratégias multiplica o número de execuções, razão pela qual é conduzida sobre uma única configuração da grade: com 3 modelos e 4 configurações, a estratégia de modelo único ajusta 12 redes, a de um modelo por indicador ajusta 84, e a de comitê ajusta 84 — esta última uma vez por configuração, e não por modelo, pois emprega os três simultaneamente.</w:t>
+        <w:t>A comparação entre as estratégias multiplica o número de execuções, razão pela qual é conduzida sobre uma única configuração da grade: com 3 modelos e 4 configurações, a estratégia de modelo único ajusta 12 redes, a de um modelo por indicador ajusta 96, e a de comitê ajusta 96 — esta última uma vez por configuração, e não por modelo, pois emprega os três simultaneamente.</w:t>
       </w:r>
     </w:p>
     <w:p>
@@ -4149,7 +4149,7 @@
           <w:b w:val="0"/>
           <w:i w:val="0"/>
         </w:rPr>
-        <w:t>A assimetria entre os dois tipos de erro é relevante para a escolha operacional do ponto de corte. O falso positivo é descartável: a instrução daquela classe viaja no prompt, e tanto o modelo de linguagem quanto a revisão humana podem recusá-la. O falso negativo é perda definitiva, porque a classe que não foi marcada não chega a ser avaliada por ninguém. Essa consideração orienta duas decisões do sistema: a priorização do recall na calibração do limiar, que em caso de empate escolhe o corte mais baixo, e o encaminhamento à revisão humana de toda notícia em que nenhum indicador foi marcado.</w:t>
+        <w:t>A assimetria entre os dois tipos de erro é relevante para a escolha operacional do ponto de corte. O falso positivo é descartável: a instrução daquela classe viaja no prompt, e tanto o modelo de linguagem quanto a revisão humana podem recusá-la. O falso negativo é perda definitiva, porque a classe que não foi marcada não chega a ser avaliada por ninguém. Essa consideração orienta duas decisões do sistema: a priorização do recall na calibração do limiar, que em caso de empate escolhe o corte mais baixo, e a retenção em acervo — e não o descarte — de toda notícia em que nenhum indicador foi marcado, de modo que um modelo posterior possa reavaliá-la.</w:t>
       </w:r>
     </w:p>
     <w:p>
@@ -4424,7 +4424,7 @@
           <w:rFonts w:ascii="Consolas" w:hAnsi="Consolas"/>
           <w:sz w:val="20"/>
         </w:rPr>
-        <w:t># sorteia a divisão e compara os seis modelos</w:t>
+        <w:t># sorteia a divisão e compara os três modelos</w:t>
       </w:r>
       <w:r>
         <w:br/>
@@ -4453,7 +4453,7 @@
           <w:rFonts w:ascii="Consolas" w:hAnsi="Consolas"/>
           <w:sz w:val="20"/>
         </w:rPr>
-        <w:t># compara as duas estratégias de ajuste na mesma partição de teste</w:t>
+        <w:t># compara as duas de rede única na mesma partição de teste</w:t>
       </w:r>
       <w:r>
         <w:br/>
@@ -4464,6 +4464,35 @@
           <w:sz w:val="20"/>
         </w:rPr>
         <w:t>python rodar_treino.py --estrategia ambas --grade 1</w:t>
+      </w:r>
+      <w:r>
+        <w:br/>
+      </w:r>
+      <w:r>
+        <w:rPr>
+          <w:rFonts w:ascii="Consolas" w:hAnsi="Consolas"/>
+          <w:sz w:val="20"/>
+        </w:rPr>
+      </w:r>
+      <w:r>
+        <w:br/>
+      </w:r>
+      <w:r>
+        <w:rPr>
+          <w:rFonts w:ascii="Consolas" w:hAnsi="Consolas"/>
+          <w:sz w:val="20"/>
+        </w:rPr>
+        <w:t># as três, incluindo o comitê, na mesma tabela</w:t>
+      </w:r>
+      <w:r>
+        <w:br/>
+      </w:r>
+      <w:r>
+        <w:rPr>
+          <w:rFonts w:ascii="Consolas" w:hAnsi="Consolas"/>
+          <w:sz w:val="20"/>
+        </w:rPr>
+        <w:t>python rodar_treino.py --estrategia todas --grade 1</w:t>
       </w:r>
       <w:r>
         <w:br/>
@@ -6455,6 +6484,65 @@
                 <w:b w:val="0"/>
                 <w:sz w:val="20"/>
               </w:rPr>
+              <w:t>vitimizacao_policial</w:t>
+            </w:r>
+          </w:p>
+        </w:tc>
+        <w:tc>
+          <w:tcPr>
+            <w:tcW w:type="dxa" w:w="4252"/>
+          </w:tcPr>
+          <w:p>
+            <w:pPr>
+              <w:spacing w:line="240" w:lineRule="auto" w:after="40" w:before="40"/>
+              <w:jc w:val="left"/>
+            </w:pPr>
+            <w:r/>
+            <w:r>
+              <w:rPr>
+                <w:b w:val="0"/>
+                <w:sz w:val="20"/>
+              </w:rPr>
+              <w:t>Agente de segurança atingido por disparo de arma de fogo — policial militar, civil, federal, guarda municipal, agente penitenciário, militar das forças armadas. Vale em serviço, de folga, à paisana, aposentado ou da reserva: o que conta é a pessoa atingida ser agente, não a situação em que estava.</w:t>
+            </w:r>
+          </w:p>
+        </w:tc>
+        <w:tc>
+          <w:tcPr>
+            <w:tcW w:type="dxa" w:w="3118"/>
+          </w:tcPr>
+          <w:p>
+            <w:pPr>
+              <w:spacing w:line="240" w:lineRule="auto" w:after="40" w:before="40"/>
+              <w:jc w:val="left"/>
+            </w:pPr>
+            <w:r/>
+            <w:r>
+              <w:rPr>
+                <w:b w:val="0"/>
+                <w:sz w:val="20"/>
+              </w:rPr>
+              <w:t>—</w:t>
+            </w:r>
+          </w:p>
+        </w:tc>
+      </w:tr>
+      <w:tr>
+        <w:tc>
+          <w:tcPr>
+            <w:tcW w:type="dxa" w:w="1701"/>
+          </w:tcPr>
+          <w:p>
+            <w:pPr>
+              <w:spacing w:line="240" w:lineRule="auto" w:after="40" w:before="40"/>
+              <w:jc w:val="left"/>
+            </w:pPr>
+            <w:r/>
+            <w:r>
+              <w:rPr>
+                <w:b w:val="0"/>
+                <w:sz w:val="20"/>
+              </w:rPr>
               <w:t>crime_organizado</w:t>
             </w:r>
           </w:p>
@@ -6686,7 +6774,7 @@
           <w:color w:val="444444"/>
           <w:sz w:val="20"/>
         </w:rPr>
-        <w:t>Tabela 9 — Os 7 indicadores que o classificador aprende, e as circunstâncias que cada um autoriza o modelo de linguagem a avaliar.</w:t>
+        <w:t>Tabela 9 — Os 8 indicadores que o classificador aprende, e as circunstâncias que cada um autoriza o modelo de linguagem a avaliar.</w:t>
       </w:r>
     </w:p>
     <w:p>
@@ -7089,7 +7177,7 @@
                 <w:b w:val="0"/>
                 <w:sz w:val="20"/>
               </w:rPr>
-              <w:t>Agente de segurança atingido por disparo. Calculado pelo sistema: marcado sempre que alguma vítima tem o tipo `agente`, que a LLM preenche ao montar a lista de vítimas.</w:t>
+              <w:t>Agente de segurança atingido por disparo de arma de fogo — policial militar, civil, federal, guarda municipal, agente penitenciário, militar das forças armadas. Vale em serviço, de folga, à paisana, aposentado ou da reserva: o que conta é a pessoa atingida ser agente, não a situação em que estava.</w:t>
             </w:r>
           </w:p>
         </w:tc>
@@ -7207,7 +7295,7 @@
                 <w:b w:val="0"/>
                 <w:sz w:val="20"/>
               </w:rPr>
-              <w:t>Três ou mais pessoas mortas por disparo na mesma ocorrência. Calculado pelo sistema sobre a lista final de vítimas, e reavaliado quando um ferido morre semanas depois.</w:t>
+              <w:t>Três ou mais pessoas mortas por disparo na mesma ocorrência, contando civis e agentes de segurança que NÃO estavam em serviço. O agente em serviço fica fora da contagem: numa ação policial ele está do outro lado do mesmo fato. Calculado pelo sistema sobre a lista final de vítimas, e reavaliado quando um ferido morre semanas depois.</w:t>
             </w:r>
           </w:p>
         </w:tc>

</xml_diff>